<commit_message>
Update Microeconometrics Assignment 2.docx
</commit_message>
<xml_diff>
--- a/data/raw/Microeconometrics Assignment 2.docx
+++ b/data/raw/Microeconometrics Assignment 2.docx
@@ -651,21 +651,7 @@
           <w:rFonts w:ascii="Times New Roman" w:hAnsi="Times New Roman" w:cs="Times New Roman"/>
           <w:color w:val="E97132" w:themeColor="accent2"/>
         </w:rPr>
-        <w:t xml:space="preserve">Gain for Group </w:t>
-      </w:r>
-      <w:r>
-        <w:rPr>
-          <w:rFonts w:ascii="Times New Roman" w:hAnsi="Times New Roman" w:cs="Times New Roman"/>
-          <w:color w:val="E97132" w:themeColor="accent2"/>
-        </w:rPr>
-        <w:t>2:</w:t>
-      </w:r>
-      <w:r>
-        <w:rPr>
-          <w:rFonts w:ascii="Times New Roman" w:hAnsi="Times New Roman" w:cs="Times New Roman"/>
-          <w:color w:val="E97132" w:themeColor="accent2"/>
-        </w:rPr>
-        <w:t xml:space="preserve"> </w:t>
+        <w:t xml:space="preserve">Gain for Group 2: </w:t>
       </w:r>
       <m:oMath>
         <m:r>
@@ -673,35 +659,7 @@
             <w:rFonts w:ascii="Cambria Math" w:hAnsi="Cambria Math" w:cs="Times New Roman"/>
             <w:color w:val="E97132" w:themeColor="accent2"/>
           </w:rPr>
-          <m:t>1</m:t>
-        </m:r>
-        <m:r>
-          <w:rPr>
-            <w:rFonts w:ascii="Cambria Math" w:hAnsi="Cambria Math" w:cs="Times New Roman"/>
-            <w:color w:val="E97132" w:themeColor="accent2"/>
-          </w:rPr>
-          <m:t>0</m:t>
-        </m:r>
-        <m:r>
-          <w:rPr>
-            <w:rFonts w:ascii="Cambria Math" w:hAnsi="Cambria Math" w:cs="Times New Roman"/>
-            <w:color w:val="E97132" w:themeColor="accent2"/>
-          </w:rPr>
-          <m:t>0-80=</m:t>
-        </m:r>
-        <m:r>
-          <w:rPr>
-            <w:rFonts w:ascii="Cambria Math" w:hAnsi="Cambria Math" w:cs="Times New Roman"/>
-            <w:color w:val="E97132" w:themeColor="accent2"/>
-          </w:rPr>
-          <m:t>2</m:t>
-        </m:r>
-        <m:r>
-          <w:rPr>
-            <w:rFonts w:ascii="Cambria Math" w:hAnsi="Cambria Math" w:cs="Times New Roman"/>
-            <w:color w:val="E97132" w:themeColor="accent2"/>
-          </w:rPr>
-          <m:t>0</m:t>
+          <m:t>100-80=20</m:t>
         </m:r>
       </m:oMath>
     </w:p>
@@ -790,14 +748,7 @@
             <w:rFonts w:ascii="Cambria Math" w:hAnsi="Cambria Math" w:cs="Times New Roman"/>
             <w:color w:val="E97132" w:themeColor="accent2"/>
           </w:rPr>
-          <m:t>=</m:t>
-        </m:r>
-        <m:r>
-          <w:rPr>
-            <w:rFonts w:ascii="Cambria Math" w:hAnsi="Cambria Math" w:cs="Times New Roman"/>
-            <w:color w:val="E97132" w:themeColor="accent2"/>
-          </w:rPr>
-          <m:t>E</m:t>
+          <m:t>=E</m:t>
         </m:r>
         <m:d>
           <m:dPr>
@@ -963,21 +914,7 @@
                 <w:rFonts w:ascii="Cambria Math" w:hAnsi="Cambria Math" w:cs="Times New Roman"/>
                 <w:color w:val="E97132" w:themeColor="accent2"/>
               </w:rPr>
-              <m:t>0.5×</m:t>
-            </m:r>
-            <m:r>
-              <w:rPr>
-                <w:rFonts w:ascii="Cambria Math" w:hAnsi="Cambria Math" w:cs="Times New Roman"/>
-                <w:color w:val="E97132" w:themeColor="accent2"/>
-              </w:rPr>
-              <m:t>2</m:t>
-            </m:r>
-            <m:r>
-              <w:rPr>
-                <w:rFonts w:ascii="Cambria Math" w:hAnsi="Cambria Math" w:cs="Times New Roman"/>
-                <w:color w:val="E97132" w:themeColor="accent2"/>
-              </w:rPr>
-              <m:t>0</m:t>
+              <m:t>0.5×20</m:t>
             </m:r>
           </m:e>
         </m:d>
@@ -1049,35 +986,7 @@
           <w:rFonts w:ascii="Times New Roman" w:hAnsi="Times New Roman" w:cs="Times New Roman"/>
           <w:color w:val="E97132" w:themeColor="accent2"/>
         </w:rPr>
-        <w:t xml:space="preserve">Calculating Average Treatment Effect </w:t>
-      </w:r>
-      <w:r>
-        <w:rPr>
-          <w:rFonts w:ascii="Times New Roman" w:hAnsi="Times New Roman" w:cs="Times New Roman"/>
-          <w:color w:val="E97132" w:themeColor="accent2"/>
-        </w:rPr>
-        <w:t xml:space="preserve">on the Treated </w:t>
-      </w:r>
-      <w:r>
-        <w:rPr>
-          <w:rFonts w:ascii="Times New Roman" w:hAnsi="Times New Roman" w:cs="Times New Roman"/>
-          <w:color w:val="E97132" w:themeColor="accent2"/>
-        </w:rPr>
-        <w:t>(AT</w:t>
-      </w:r>
-      <w:r>
-        <w:rPr>
-          <w:rFonts w:ascii="Times New Roman" w:hAnsi="Times New Roman" w:cs="Times New Roman"/>
-          <w:color w:val="E97132" w:themeColor="accent2"/>
-        </w:rPr>
-        <w:t>T</w:t>
-      </w:r>
-      <w:r>
-        <w:rPr>
-          <w:rFonts w:ascii="Times New Roman" w:hAnsi="Times New Roman" w:cs="Times New Roman"/>
-          <w:color w:val="E97132" w:themeColor="accent2"/>
-        </w:rPr>
-        <w:t>)</w:t>
+        <w:t>Calculating Average Treatment Effect on the Treated (ATT)</w:t>
       </w:r>
     </w:p>
     <w:p>
@@ -1099,17 +1008,7 @@
             <w:rFonts w:ascii="Cambria Math" w:hAnsi="Cambria Math" w:cs="Times New Roman"/>
             <w:color w:val="E97132" w:themeColor="accent2"/>
           </w:rPr>
-          <m:t>AT</m:t>
-        </m:r>
-        <m:r>
-          <m:rPr>
-            <m:sty m:val="p"/>
-          </m:rPr>
-          <w:rPr>
-            <w:rFonts w:ascii="Cambria Math" w:hAnsi="Cambria Math" w:cs="Times New Roman"/>
-            <w:color w:val="E97132" w:themeColor="accent2"/>
-          </w:rPr>
-          <m:t>T</m:t>
+          <m:t>ATT</m:t>
         </m:r>
         <m:r>
           <w:rPr>
@@ -1235,17 +1134,7 @@
             <w:rFonts w:ascii="Cambria Math" w:hAnsi="Cambria Math" w:cs="Times New Roman"/>
             <w:color w:val="E97132" w:themeColor="accent2"/>
           </w:rPr>
-          <m:t>AT</m:t>
-        </m:r>
-        <m:r>
-          <m:rPr>
-            <m:sty m:val="p"/>
-          </m:rPr>
-          <w:rPr>
-            <w:rFonts w:ascii="Cambria Math" w:hAnsi="Cambria Math" w:cs="Times New Roman"/>
-            <w:color w:val="E97132" w:themeColor="accent2"/>
-          </w:rPr>
-          <m:t>T</m:t>
+          <m:t>ATT</m:t>
         </m:r>
         <m:r>
           <w:rPr>
@@ -1336,21 +1225,7 @@
           <w:rFonts w:ascii="Times New Roman" w:hAnsi="Times New Roman" w:cs="Times New Roman"/>
           <w:color w:val="E97132" w:themeColor="accent2"/>
         </w:rPr>
-        <w:t>The AT</w:t>
-      </w:r>
-      <w:r>
-        <w:rPr>
-          <w:rFonts w:ascii="Times New Roman" w:hAnsi="Times New Roman" w:cs="Times New Roman"/>
-          <w:color w:val="E97132" w:themeColor="accent2"/>
-        </w:rPr>
-        <w:t>T</w:t>
-      </w:r>
-      <w:r>
-        <w:rPr>
-          <w:rFonts w:ascii="Times New Roman" w:hAnsi="Times New Roman" w:cs="Times New Roman"/>
-          <w:color w:val="E97132" w:themeColor="accent2"/>
-        </w:rPr>
-        <w:t xml:space="preserve"> is </w:t>
+        <w:t xml:space="preserve">The ATT is </w:t>
       </w:r>
       <m:oMath>
         <m:r>
@@ -1368,17 +1243,7 @@
             <w:rFonts w:ascii="Cambria Math" w:hAnsi="Cambria Math" w:cs="Times New Roman"/>
             <w:color w:val="E97132" w:themeColor="accent2"/>
           </w:rPr>
-          <m:t>/day</m:t>
-        </m:r>
-        <m:r>
-          <m:rPr>
-            <m:sty m:val="p"/>
-          </m:rPr>
-          <w:rPr>
-            <w:rFonts w:ascii="Cambria Math" w:hAnsi="Cambria Math" w:cs="Times New Roman"/>
-            <w:color w:val="E97132" w:themeColor="accent2"/>
-          </w:rPr>
-          <m:t xml:space="preserve"> </m:t>
+          <m:t xml:space="preserve">/day </m:t>
         </m:r>
       </m:oMath>
       <w:r>
@@ -1395,15 +1260,7 @@
           <w:iCs/>
           <w:color w:val="E97132" w:themeColor="accent2"/>
         </w:rPr>
-        <w:t xml:space="preserve"> </w:t>
-      </w:r>
-      <w:r>
-        <w:rPr>
-          <w:rFonts w:ascii="Times New Roman" w:hAnsi="Times New Roman" w:cs="Times New Roman"/>
-          <w:iCs/>
-          <w:color w:val="E97132" w:themeColor="accent2"/>
-        </w:rPr>
-        <w:t>random assignment ensures that the treatment group (</w:t>
+        <w:t xml:space="preserve"> random assignment ensures that the treatment group (</w:t>
       </w:r>
       <m:oMath>
         <m:r>
@@ -1521,17 +1378,8 @@
           <w:rFonts w:ascii="Times New Roman" w:hAnsi="Times New Roman" w:cs="Times New Roman"/>
           <w:u w:val="single"/>
         </w:rPr>
-        <w:t xml:space="preserve">only half of the people assigned to the treatment group </w:t>
-      </w:r>
-      <w:proofErr w:type="gramStart"/>
-      <w:r>
-        <w:rPr>
-          <w:rFonts w:ascii="Times New Roman" w:hAnsi="Times New Roman" w:cs="Times New Roman"/>
-          <w:u w:val="single"/>
-        </w:rPr>
-        <w:t>participate</w:t>
-      </w:r>
-      <w:proofErr w:type="gramEnd"/>
+        <w:t>only half of the people assigned to the treatment group participate</w:t>
+      </w:r>
       <w:r>
         <w:rPr>
           <w:rFonts w:ascii="Times New Roman" w:hAnsi="Times New Roman" w:cs="Times New Roman"/>
@@ -1738,21 +1586,7 @@
                 <w:rFonts w:ascii="Cambria Math" w:hAnsi="Cambria Math" w:cs="Times New Roman"/>
                 <w:color w:val="E97132" w:themeColor="accent2"/>
               </w:rPr>
-              <m:t>|</m:t>
-            </m:r>
-            <m:r>
-              <w:rPr>
-                <w:rFonts w:ascii="Cambria Math" w:hAnsi="Cambria Math" w:cs="Times New Roman"/>
-                <w:color w:val="E97132" w:themeColor="accent2"/>
-              </w:rPr>
-              <m:t>P</m:t>
-            </m:r>
-            <m:r>
-              <w:rPr>
-                <w:rFonts w:ascii="Cambria Math" w:hAnsi="Cambria Math" w:cs="Times New Roman"/>
-                <w:color w:val="E97132" w:themeColor="accent2"/>
-              </w:rPr>
-              <m:t>=1</m:t>
+              <m:t>|P=1</m:t>
             </m:r>
           </m:e>
         </m:d>
@@ -1996,21 +1830,7 @@
                 <w:rFonts w:ascii="Cambria Math" w:hAnsi="Cambria Math" w:cs="Times New Roman"/>
                 <w:color w:val="E97132" w:themeColor="accent2"/>
               </w:rPr>
-              <m:t>×</m:t>
-            </m:r>
-            <m:r>
-              <w:rPr>
-                <w:rFonts w:ascii="Cambria Math" w:hAnsi="Cambria Math" w:cs="Times New Roman"/>
-                <w:color w:val="E97132" w:themeColor="accent2"/>
-              </w:rPr>
-              <m:t>$</m:t>
-            </m:r>
-            <m:r>
-              <w:rPr>
-                <w:rFonts w:ascii="Cambria Math" w:hAnsi="Cambria Math" w:cs="Times New Roman"/>
-                <w:color w:val="E97132" w:themeColor="accent2"/>
-              </w:rPr>
-              <m:t>40</m:t>
+              <m:t>×$40</m:t>
             </m:r>
             <m:ctrlPr>
               <w:rPr>
@@ -2027,35 +1847,7 @@
             <w:rFonts w:ascii="Cambria Math" w:hAnsi="Cambria Math" w:cs="Times New Roman"/>
             <w:color w:val="E97132" w:themeColor="accent2"/>
           </w:rPr>
-          <m:t>+(</m:t>
-        </m:r>
-        <m:r>
-          <w:rPr>
-            <w:rFonts w:ascii="Cambria Math" w:hAnsi="Cambria Math" w:cs="Times New Roman"/>
-            <w:color w:val="E97132" w:themeColor="accent2"/>
-          </w:rPr>
-          <m:t>.25</m:t>
-        </m:r>
-        <m:r>
-          <w:rPr>
-            <w:rFonts w:ascii="Cambria Math" w:hAnsi="Cambria Math" w:cs="Times New Roman"/>
-            <w:color w:val="E97132" w:themeColor="accent2"/>
-          </w:rPr>
-          <m:t>×</m:t>
-        </m:r>
-        <m:r>
-          <w:rPr>
-            <w:rFonts w:ascii="Cambria Math" w:hAnsi="Cambria Math" w:cs="Times New Roman"/>
-            <w:color w:val="E97132" w:themeColor="accent2"/>
-          </w:rPr>
-          <m:t>$</m:t>
-        </m:r>
-        <m:r>
-          <w:rPr>
-            <w:rFonts w:ascii="Cambria Math" w:hAnsi="Cambria Math" w:cs="Times New Roman"/>
-            <w:color w:val="E97132" w:themeColor="accent2"/>
-          </w:rPr>
-          <m:t>20)</m:t>
+          <m:t>+(.25×$20)</m:t>
         </m:r>
       </m:oMath>
       <w:r>
@@ -2152,14 +1944,7 @@
             <w:rFonts w:ascii="Cambria Math" w:hAnsi="Cambria Math" w:cs="Times New Roman"/>
             <w:color w:val="E97132" w:themeColor="accent2"/>
           </w:rPr>
-          <m:t>$3</m:t>
-        </m:r>
-        <m:r>
-          <w:rPr>
-            <w:rFonts w:ascii="Cambria Math" w:hAnsi="Cambria Math" w:cs="Times New Roman"/>
-            <w:color w:val="E97132" w:themeColor="accent2"/>
-          </w:rPr>
-          <m:t>5</m:t>
+          <m:t>$35</m:t>
         </m:r>
         <m:r>
           <m:rPr>
@@ -2730,6 +2515,7 @@
       <w:pPr>
         <w:rPr>
           <w:rFonts w:ascii="Times New Roman" w:hAnsi="Times New Roman" w:cs="Times New Roman"/>
+          <w:color w:val="E97132" w:themeColor="accent2"/>
         </w:rPr>
       </w:pPr>
       <m:oMathPara>
@@ -2740,313 +2526,843 @@
             </m:rPr>
             <w:rPr>
               <w:rFonts w:ascii="Cambria Math" w:hAnsi="Cambria Math" w:cs="Times New Roman"/>
+              <w:color w:val="E97132" w:themeColor="accent2"/>
             </w:rPr>
             <m:t>n</m:t>
           </m:r>
           <m:r>
             <w:rPr>
               <w:rFonts w:ascii="Cambria Math" w:hAnsi="Cambria Math" w:cs="Times New Roman"/>
+              <w:color w:val="E97132" w:themeColor="accent2"/>
             </w:rPr>
-            <m:t> = \</m:t>
+            <m:t> = </m:t>
           </m:r>
-          <m:r>
-            <m:rPr>
-              <m:sty m:val="p"/>
-            </m:rPr>
-            <w:rPr>
-              <w:rFonts w:ascii="Cambria Math" w:hAnsi="Cambria Math" w:cs="Times New Roman"/>
-            </w:rPr>
-            <m:t>frac</m:t>
-          </m:r>
-          <m:sSup>
-            <m:sSupPr>
+          <m:f>
+            <m:fPr>
               <m:ctrlPr>
                 <w:rPr>
                   <w:rFonts w:ascii="Cambria Math" w:hAnsi="Cambria Math" w:cs="Times New Roman"/>
                   <w:i/>
+                  <w:color w:val="E97132" w:themeColor="accent2"/>
                 </w:rPr>
               </m:ctrlPr>
-            </m:sSupPr>
-            <m:e>
+            </m:fPr>
+            <m:num>
+              <m:sSup>
+                <m:sSupPr>
+                  <m:ctrlPr>
+                    <w:rPr>
+                      <w:rFonts w:ascii="Cambria Math" w:hAnsi="Cambria Math" w:cs="Times New Roman"/>
+                      <w:i/>
+                      <w:color w:val="E97132" w:themeColor="accent2"/>
+                    </w:rPr>
+                  </m:ctrlPr>
+                </m:sSupPr>
+                <m:e>
+                  <m:d>
+                    <m:dPr>
+                      <m:ctrlPr>
+                        <w:rPr>
+                          <w:rFonts w:ascii="Cambria Math" w:hAnsi="Cambria Math" w:cs="Times New Roman"/>
+                          <w:i/>
+                          <w:color w:val="E97132" w:themeColor="accent2"/>
+                        </w:rPr>
+                      </m:ctrlPr>
+                    </m:dPr>
+                    <m:e>
+                      <m:sSub>
+                        <m:sSubPr>
+                          <m:ctrlPr>
+                            <w:rPr>
+                              <w:rFonts w:ascii="Cambria Math" w:hAnsi="Cambria Math" w:cs="Times New Roman"/>
+                              <w:i/>
+                              <w:color w:val="E97132" w:themeColor="accent2"/>
+                            </w:rPr>
+                          </m:ctrlPr>
+                        </m:sSubPr>
+                        <m:e>
+                          <m:r>
+                            <w:rPr>
+                              <w:rFonts w:ascii="Cambria Math" w:hAnsi="Cambria Math" w:cs="Times New Roman"/>
+                              <w:color w:val="E97132" w:themeColor="accent2"/>
+                            </w:rPr>
+                            <m:t>t</m:t>
+                          </m:r>
+                        </m:e>
+                        <m:sub>
+                          <m:r>
+                            <w:rPr>
+                              <w:rFonts w:ascii="Cambria Math" w:hAnsi="Cambria Math" w:cs="Times New Roman"/>
+                              <w:color w:val="E97132" w:themeColor="accent2"/>
+                            </w:rPr>
+                            <m:t>1-</m:t>
+                          </m:r>
+                          <m:f>
+                            <m:fPr>
+                              <m:ctrlPr>
+                                <w:rPr>
+                                  <w:rFonts w:ascii="Cambria Math" w:hAnsi="Cambria Math" w:cs="Times New Roman"/>
+                                  <w:i/>
+                                  <w:color w:val="E97132" w:themeColor="accent2"/>
+                                </w:rPr>
+                              </m:ctrlPr>
+                            </m:fPr>
+                            <m:num>
+                              <m:r>
+                                <w:rPr>
+                                  <w:rFonts w:ascii="Cambria Math" w:hAnsi="Cambria Math" w:cs="Times New Roman"/>
+                                  <w:color w:val="E97132" w:themeColor="accent2"/>
+                                </w:rPr>
+                                <m:t>a</m:t>
+                              </m:r>
+                            </m:num>
+                            <m:den>
+                              <m:r>
+                                <w:rPr>
+                                  <w:rFonts w:ascii="Cambria Math" w:hAnsi="Cambria Math" w:cs="Times New Roman"/>
+                                  <w:color w:val="E97132" w:themeColor="accent2"/>
+                                </w:rPr>
+                                <m:t>2</m:t>
+                              </m:r>
+                            </m:den>
+                          </m:f>
+                        </m:sub>
+                      </m:sSub>
+                      <m:r>
+                        <w:rPr>
+                          <w:rFonts w:ascii="Cambria Math" w:hAnsi="Cambria Math" w:cs="Times New Roman"/>
+                          <w:color w:val="E97132" w:themeColor="accent2"/>
+                        </w:rPr>
+                        <m:t>+</m:t>
+                      </m:r>
+                      <m:sSub>
+                        <m:sSubPr>
+                          <m:ctrlPr>
+                            <w:rPr>
+                              <w:rFonts w:ascii="Cambria Math" w:hAnsi="Cambria Math" w:cs="Times New Roman"/>
+                              <w:i/>
+                              <w:color w:val="E97132" w:themeColor="accent2"/>
+                            </w:rPr>
+                          </m:ctrlPr>
+                        </m:sSubPr>
+                        <m:e>
+                          <m:r>
+                            <w:rPr>
+                              <w:rFonts w:ascii="Cambria Math" w:hAnsi="Cambria Math" w:cs="Times New Roman"/>
+                              <w:color w:val="E97132" w:themeColor="accent2"/>
+                            </w:rPr>
+                            <m:t>t</m:t>
+                          </m:r>
+                        </m:e>
+                        <m:sub>
+                          <m:r>
+                            <w:rPr>
+                              <w:rFonts w:ascii="Cambria Math" w:hAnsi="Cambria Math" w:cs="Times New Roman"/>
+                              <w:color w:val="E97132" w:themeColor="accent2"/>
+                            </w:rPr>
+                            <m:t>k</m:t>
+                          </m:r>
+                        </m:sub>
+                      </m:sSub>
+                    </m:e>
+                  </m:d>
+                </m:e>
+                <m:sup>
+                  <m:r>
+                    <w:rPr>
+                      <w:rFonts w:ascii="Cambria Math" w:hAnsi="Cambria Math" w:cs="Times New Roman"/>
+                      <w:color w:val="E97132" w:themeColor="accent2"/>
+                    </w:rPr>
+                    <m:t>2</m:t>
+                  </m:r>
+                </m:sup>
+              </m:sSup>
+              <m:sSup>
+                <m:sSupPr>
+                  <m:ctrlPr>
+                    <w:rPr>
+                      <w:rFonts w:ascii="Cambria Math" w:hAnsi="Cambria Math" w:cs="Times New Roman"/>
+                      <w:i/>
+                      <w:color w:val="E97132" w:themeColor="accent2"/>
+                    </w:rPr>
+                  </m:ctrlPr>
+                </m:sSupPr>
+                <m:e>
+                  <m:r>
+                    <w:rPr>
+                      <w:rFonts w:ascii="Cambria Math" w:hAnsi="Cambria Math" w:cs="Times New Roman"/>
+                      <w:color w:val="E97132" w:themeColor="accent2"/>
+                    </w:rPr>
+                    <m:t>σ</m:t>
+                  </m:r>
+                </m:e>
+                <m:sup>
+                  <m:r>
+                    <w:rPr>
+                      <w:rFonts w:ascii="Cambria Math" w:hAnsi="Cambria Math" w:cs="Times New Roman"/>
+                      <w:color w:val="E97132" w:themeColor="accent2"/>
+                    </w:rPr>
+                    <m:t>2</m:t>
+                  </m:r>
+                </m:sup>
+              </m:sSup>
               <m:d>
                 <m:dPr>
                   <m:ctrlPr>
                     <w:rPr>
                       <w:rFonts w:ascii="Cambria Math" w:hAnsi="Cambria Math" w:cs="Times New Roman"/>
                       <w:i/>
+                      <w:color w:val="E97132" w:themeColor="accent2"/>
                     </w:rPr>
                   </m:ctrlPr>
                 </m:dPr>
                 <m:e>
-                  <m:sSub>
-                    <m:sSubPr>
+                  <m:f>
+                    <m:fPr>
                       <m:ctrlPr>
                         <w:rPr>
                           <w:rFonts w:ascii="Cambria Math" w:hAnsi="Cambria Math" w:cs="Times New Roman"/>
                           <w:i/>
+                          <w:color w:val="E97132" w:themeColor="accent2"/>
                         </w:rPr>
                       </m:ctrlPr>
-                    </m:sSubPr>
-                    <m:e>
-                      <m:r>
-                        <m:rPr>
-                          <m:sty m:val="p"/>
-                        </m:rPr>
-                        <w:rPr>
-                          <w:rFonts w:ascii="Cambria Math" w:hAnsi="Cambria Math" w:cs="Times New Roman"/>
-                        </w:rPr>
-                        <m:t>t</m:t>
-                      </m:r>
-                    </m:e>
-                    <m:sub>
+                    </m:fPr>
+                    <m:num>
                       <m:r>
                         <w:rPr>
                           <w:rFonts w:ascii="Cambria Math" w:hAnsi="Cambria Math" w:cs="Times New Roman"/>
+                          <w:color w:val="E97132" w:themeColor="accent2"/>
                         </w:rPr>
-                        <m:t>1-</m:t>
+                        <m:t>1</m:t>
                       </m:r>
+                    </m:num>
+                    <m:den>
                       <m:r>
                         <w:rPr>
                           <w:rFonts w:ascii="Cambria Math" w:hAnsi="Cambria Math" w:cs="Times New Roman"/>
+                          <w:color w:val="E97132" w:themeColor="accent2"/>
                         </w:rPr>
-                        <m:t>α</m:t>
+                        <m:t>p</m:t>
                       </m:r>
-                      <m:r>
-                        <m:rPr>
-                          <m:lit/>
-                        </m:rPr>
-                        <w:rPr>
-                          <w:rFonts w:ascii="Cambria Math" w:hAnsi="Cambria Math" w:cs="Times New Roman"/>
-                        </w:rPr>
-                        <m:t>/</m:t>
-                      </m:r>
-                      <m:r>
-                        <w:rPr>
-                          <w:rFonts w:ascii="Cambria Math" w:hAnsi="Cambria Math" w:cs="Times New Roman"/>
-                        </w:rPr>
-                        <m:t>2</m:t>
-                      </m:r>
-                    </m:sub>
-                  </m:sSub>
+                    </m:den>
+                  </m:f>
                   <m:r>
                     <w:rPr>
                       <w:rFonts w:ascii="Cambria Math" w:hAnsi="Cambria Math" w:cs="Times New Roman"/>
+                      <w:color w:val="E97132" w:themeColor="accent2"/>
                     </w:rPr>
-                    <m:t> + </m:t>
+                    <m:t>+</m:t>
                   </m:r>
-                  <m:sSub>
-                    <m:sSubPr>
+                  <m:f>
+                    <m:fPr>
                       <m:ctrlPr>
                         <w:rPr>
                           <w:rFonts w:ascii="Cambria Math" w:hAnsi="Cambria Math" w:cs="Times New Roman"/>
                           <w:i/>
+                          <w:color w:val="E97132" w:themeColor="accent2"/>
                         </w:rPr>
                       </m:ctrlPr>
-                    </m:sSubPr>
-                    <m:e>
-                      <m:r>
-                        <m:rPr>
-                          <m:sty m:val="p"/>
-                        </m:rPr>
-                        <w:rPr>
-                          <w:rFonts w:ascii="Cambria Math" w:hAnsi="Cambria Math" w:cs="Times New Roman"/>
-                        </w:rPr>
-                        <m:t>t</m:t>
-                      </m:r>
-                    </m:e>
-                    <m:sub>
+                    </m:fPr>
+                    <m:num>
                       <m:r>
                         <w:rPr>
                           <w:rFonts w:ascii="Cambria Math" w:hAnsi="Cambria Math" w:cs="Times New Roman"/>
+                          <w:color w:val="E97132" w:themeColor="accent2"/>
                         </w:rPr>
-                        <m:t>κ</m:t>
+                        <m:t>1</m:t>
                       </m:r>
-                    </m:sub>
-                  </m:sSub>
+                    </m:num>
+                    <m:den>
+                      <m:r>
+                        <w:rPr>
+                          <w:rFonts w:ascii="Cambria Math" w:hAnsi="Cambria Math" w:cs="Times New Roman"/>
+                          <w:color w:val="E97132" w:themeColor="accent2"/>
+                        </w:rPr>
+                        <m:t>1-p</m:t>
+                      </m:r>
+                    </m:den>
+                  </m:f>
                 </m:e>
               </m:d>
-            </m:e>
-            <m:sup>
+            </m:num>
+            <m:den>
               <m:r>
                 <w:rPr>
                   <w:rFonts w:ascii="Cambria Math" w:hAnsi="Cambria Math" w:cs="Times New Roman"/>
+                  <w:color w:val="E97132" w:themeColor="accent2"/>
                 </w:rPr>
-                <m:t>2</m:t>
+                <m:t>MD</m:t>
               </m:r>
-            </m:sup>
-          </m:sSup>
+              <m:sSup>
+                <m:sSupPr>
+                  <m:ctrlPr>
+                    <w:rPr>
+                      <w:rFonts w:ascii="Cambria Math" w:hAnsi="Cambria Math" w:cs="Times New Roman"/>
+                      <w:i/>
+                      <w:color w:val="E97132" w:themeColor="accent2"/>
+                    </w:rPr>
+                  </m:ctrlPr>
+                </m:sSupPr>
+                <m:e>
+                  <m:r>
+                    <w:rPr>
+                      <w:rFonts w:ascii="Cambria Math" w:hAnsi="Cambria Math" w:cs="Times New Roman"/>
+                      <w:color w:val="E97132" w:themeColor="accent2"/>
+                    </w:rPr>
+                    <m:t>E</m:t>
+                  </m:r>
+                </m:e>
+                <m:sup>
+                  <m:r>
+                    <w:rPr>
+                      <w:rFonts w:ascii="Cambria Math" w:hAnsi="Cambria Math" w:cs="Times New Roman"/>
+                      <w:color w:val="E97132" w:themeColor="accent2"/>
+                    </w:rPr>
+                    <m:t>2</m:t>
+                  </m:r>
+                </m:sup>
+              </m:sSup>
+            </m:den>
+          </m:f>
+        </m:oMath>
+      </m:oMathPara>
+    </w:p>
+    <w:p>
+      <w:pPr>
+        <w:numPr>
+          <w:ilvl w:val="0"/>
+          <w:numId w:val="2"/>
+        </w:numPr>
+        <w:rPr>
+          <w:rFonts w:ascii="Cambria Math" w:hAnsi="Cambria Math"/>
+          <w:i/>
+          <w:color w:val="E97132" w:themeColor="accent2"/>
+        </w:rPr>
+      </w:pPr>
+      <m:oMath>
+        <m:sSub>
+          <m:sSubPr>
+            <m:ctrlPr>
+              <w:rPr>
+                <w:rFonts w:ascii="Cambria Math" w:hAnsi="Cambria Math"/>
+                <w:i/>
+                <w:color w:val="E97132" w:themeColor="accent2"/>
+              </w:rPr>
+            </m:ctrlPr>
+          </m:sSubPr>
+          <m:e>
+            <m:r>
+              <w:rPr>
+                <w:rFonts w:ascii="Cambria Math" w:hAnsi="Cambria Math"/>
+                <w:color w:val="E97132" w:themeColor="accent2"/>
+              </w:rPr>
+              <m:t>(t</m:t>
+            </m:r>
+          </m:e>
+          <m:sub>
+            <m:r>
+              <w:rPr>
+                <w:rFonts w:ascii="Cambria Math" w:hAnsi="Cambria Math"/>
+                <w:color w:val="E97132" w:themeColor="accent2"/>
+              </w:rPr>
+              <m:t>1-α/2</m:t>
+            </m:r>
+          </m:sub>
+        </m:sSub>
+        <m:r>
+          <w:rPr>
+            <w:rFonts w:ascii="Cambria Math" w:hAnsi="Cambria Math"/>
+            <w:color w:val="E97132" w:themeColor="accent2"/>
+          </w:rPr>
+          <m:t>+</m:t>
+        </m:r>
+        <m:sSub>
+          <m:sSubPr>
+            <m:ctrlPr>
+              <w:rPr>
+                <w:rFonts w:ascii="Cambria Math" w:hAnsi="Cambria Math"/>
+                <w:i/>
+                <w:color w:val="E97132" w:themeColor="accent2"/>
+              </w:rPr>
+            </m:ctrlPr>
+          </m:sSubPr>
+          <m:e>
+            <m:r>
+              <w:rPr>
+                <w:rFonts w:ascii="Cambria Math" w:hAnsi="Cambria Math"/>
+                <w:color w:val="E97132" w:themeColor="accent2"/>
+              </w:rPr>
+              <m:t>t</m:t>
+            </m:r>
+          </m:e>
+          <m:sub>
+            <m:r>
+              <w:rPr>
+                <w:rFonts w:ascii="Cambria Math" w:hAnsi="Cambria Math"/>
+                <w:color w:val="E97132" w:themeColor="accent2"/>
+              </w:rPr>
+              <m:t>κ</m:t>
+            </m:r>
+          </m:sub>
+        </m:sSub>
+        <m:r>
+          <w:rPr>
+            <w:rFonts w:ascii="Cambria Math" w:hAnsi="Cambria Math"/>
+            <w:color w:val="E97132" w:themeColor="accent2"/>
+          </w:rPr>
+          <m:t>)=1.96+1.28=3.24</m:t>
+        </m:r>
+      </m:oMath>
+    </w:p>
+    <w:p>
+      <w:pPr>
+        <w:numPr>
+          <w:ilvl w:val="0"/>
+          <w:numId w:val="2"/>
+        </w:numPr>
+        <w:rPr>
+          <w:rFonts w:ascii="Cambria Math" w:hAnsi="Cambria Math" w:cs="Times New Roman"/>
+          <w:i/>
+          <w:color w:val="E97132" w:themeColor="accent2"/>
+        </w:rPr>
+      </w:pPr>
+      <m:oMath>
+        <m:d>
+          <m:dPr>
+            <m:sepChr m:val="="/>
+            <m:endChr m:val=""/>
+            <m:ctrlPr>
+              <w:rPr>
+                <w:rFonts w:ascii="Cambria Math" w:hAnsi="Cambria Math" w:cs="Times New Roman"/>
+                <w:i/>
+                <w:color w:val="E97132" w:themeColor="accent2"/>
+              </w:rPr>
+            </m:ctrlPr>
+          </m:dPr>
+          <m:e>
+            <m:r>
+              <w:rPr>
+                <w:rFonts w:ascii="Cambria Math" w:hAnsi="Cambria Math" w:cs="Times New Roman"/>
+                <w:color w:val="E97132" w:themeColor="accent2"/>
+              </w:rPr>
+              <m:t>3.24</m:t>
+            </m:r>
+            <m:sSup>
+              <m:sSupPr>
+                <m:ctrlPr>
+                  <w:rPr>
+                    <w:rFonts w:ascii="Cambria Math" w:hAnsi="Cambria Math" w:cs="Times New Roman"/>
+                    <w:i/>
+                    <w:color w:val="E97132" w:themeColor="accent2"/>
+                  </w:rPr>
+                </m:ctrlPr>
+              </m:sSupPr>
+              <m:e>
+                <m:r>
+                  <w:rPr>
+                    <w:rFonts w:ascii="Cambria Math" w:hAnsi="Cambria Math" w:cs="Times New Roman"/>
+                    <w:color w:val="E97132" w:themeColor="accent2"/>
+                  </w:rPr>
+                  <m:t>)</m:t>
+                </m:r>
+              </m:e>
+              <m:sup>
+                <m:r>
+                  <w:rPr>
+                    <w:rFonts w:ascii="Cambria Math" w:hAnsi="Cambria Math" w:cs="Times New Roman"/>
+                    <w:color w:val="E97132" w:themeColor="accent2"/>
+                  </w:rPr>
+                  <m:t>2</m:t>
+                </m:r>
+              </m:sup>
+            </m:sSup>
+          </m:e>
+          <m:e>
+            <m:r>
+              <w:rPr>
+                <w:rFonts w:ascii="Cambria Math" w:hAnsi="Cambria Math" w:cs="Times New Roman"/>
+                <w:color w:val="E97132" w:themeColor="accent2"/>
+              </w:rPr>
+              <m:t>10.4976</m:t>
+            </m:r>
+          </m:e>
+        </m:d>
+      </m:oMath>
+    </w:p>
+    <w:p>
+      <w:pPr>
+        <w:numPr>
+          <w:ilvl w:val="0"/>
+          <w:numId w:val="2"/>
+        </w:numPr>
+        <w:rPr>
+          <w:rFonts w:ascii="Cambria Math" w:hAnsi="Cambria Math" w:cs="Times New Roman"/>
+          <w:i/>
+          <w:color w:val="E97132" w:themeColor="accent2"/>
+        </w:rPr>
+      </w:pPr>
+      <m:oMath>
+        <m:r>
+          <w:rPr>
+            <w:rFonts w:ascii="Cambria Math" w:hAnsi="Cambria Math" w:cs="Times New Roman"/>
+            <w:color w:val="E97132" w:themeColor="accent2"/>
+          </w:rPr>
+          <m:t>10.4976⋅36⋅4.1667≈1574.64</m:t>
+        </m:r>
+      </m:oMath>
+    </w:p>
+    <w:p>
+      <w:pPr>
+        <w:numPr>
+          <w:ilvl w:val="0"/>
+          <w:numId w:val="2"/>
+        </w:numPr>
+        <w:rPr>
+          <w:rFonts w:ascii="Cambria Math" w:hAnsi="Cambria Math" w:cs="Times New Roman"/>
+          <w:i/>
+          <w:color w:val="E97132" w:themeColor="accent2"/>
+        </w:rPr>
+      </w:pPr>
+      <w:r>
+        <w:rPr>
+          <w:rFonts w:ascii="Cambria Math" w:hAnsi="Cambria Math" w:cs="Times New Roman"/>
+          <w:iCs/>
+          <w:color w:val="E97132" w:themeColor="accent2"/>
+        </w:rPr>
+        <w:t>Divide by</w:t>
+      </w:r>
+      <w:r>
+        <w:rPr>
+          <w:rFonts w:ascii="Cambria Math" w:hAnsi="Cambria Math" w:cs="Times New Roman"/>
+          <w:i/>
+          <w:color w:val="E97132" w:themeColor="accent2"/>
+        </w:rPr>
+        <w:t xml:space="preserve"> </w:t>
+      </w:r>
+      <m:oMath>
+        <m:r>
+          <w:rPr>
+            <w:rFonts w:ascii="Cambria Math" w:hAnsi="Cambria Math" w:cs="Times New Roman"/>
+            <w:color w:val="E97132" w:themeColor="accent2"/>
+          </w:rPr>
+          <m:t>MD</m:t>
+        </m:r>
+        <m:sSup>
+          <m:sSupPr>
+            <m:ctrlPr>
+              <w:rPr>
+                <w:rFonts w:ascii="Cambria Math" w:hAnsi="Cambria Math" w:cs="Times New Roman"/>
+                <w:i/>
+                <w:color w:val="E97132" w:themeColor="accent2"/>
+              </w:rPr>
+            </m:ctrlPr>
+          </m:sSupPr>
+          <m:e>
+            <m:r>
+              <w:rPr>
+                <w:rFonts w:ascii="Cambria Math" w:hAnsi="Cambria Math" w:cs="Times New Roman"/>
+                <w:color w:val="E97132" w:themeColor="accent2"/>
+              </w:rPr>
+              <m:t>E</m:t>
+            </m:r>
+          </m:e>
+          <m:sup>
+            <m:r>
+              <w:rPr>
+                <w:rFonts w:ascii="Cambria Math" w:hAnsi="Cambria Math" w:cs="Times New Roman"/>
+                <w:color w:val="E97132" w:themeColor="accent2"/>
+              </w:rPr>
+              <m:t>2</m:t>
+            </m:r>
+          </m:sup>
+        </m:sSup>
+        <m:r>
+          <w:rPr>
+            <w:rFonts w:ascii="Cambria Math" w:hAnsi="Cambria Math" w:cs="Times New Roman"/>
+            <w:color w:val="E97132" w:themeColor="accent2"/>
+          </w:rPr>
+          <m:t>=</m:t>
+        </m:r>
+        <m:sSup>
+          <m:sSupPr>
+            <m:ctrlPr>
+              <w:rPr>
+                <w:rFonts w:ascii="Cambria Math" w:hAnsi="Cambria Math" w:cs="Times New Roman"/>
+                <w:i/>
+                <w:color w:val="E97132" w:themeColor="accent2"/>
+              </w:rPr>
+            </m:ctrlPr>
+          </m:sSupPr>
+          <m:e>
+            <m:r>
+              <w:rPr>
+                <w:rFonts w:ascii="Cambria Math" w:hAnsi="Cambria Math" w:cs="Times New Roman"/>
+                <w:color w:val="E97132" w:themeColor="accent2"/>
+              </w:rPr>
+              <m:t>2</m:t>
+            </m:r>
+          </m:e>
+          <m:sup>
+            <m:r>
+              <w:rPr>
+                <w:rFonts w:ascii="Cambria Math" w:hAnsi="Cambria Math" w:cs="Times New Roman"/>
+                <w:color w:val="E97132" w:themeColor="accent2"/>
+              </w:rPr>
+              <m:t>2</m:t>
+            </m:r>
+          </m:sup>
+        </m:sSup>
+        <m:r>
+          <w:rPr>
+            <w:rFonts w:ascii="Cambria Math" w:hAnsi="Cambria Math" w:cs="Times New Roman"/>
+            <w:color w:val="E97132" w:themeColor="accent2"/>
+          </w:rPr>
+          <m:t>=4</m:t>
+        </m:r>
+      </m:oMath>
+      <w:r>
+        <w:rPr>
+          <w:rFonts w:ascii="Cambria Math" w:hAnsi="Cambria Math" w:cs="Times New Roman"/>
+          <w:i/>
+          <w:color w:val="E97132" w:themeColor="accent2"/>
+        </w:rPr>
+        <w:t>:</w:t>
+      </w:r>
+    </w:p>
+    <w:p>
+      <w:pPr>
+        <w:rPr>
+          <w:rFonts w:ascii="Cambria Math" w:hAnsi="Cambria Math" w:cs="Times New Roman"/>
+          <w:i/>
+          <w:color w:val="E97132" w:themeColor="accent2"/>
+        </w:rPr>
+      </w:pPr>
+      <m:oMathPara>
+        <m:oMath>
           <m:r>
             <w:rPr>
               <w:rFonts w:ascii="Cambria Math" w:hAnsi="Cambria Math" w:cs="Times New Roman"/>
+              <w:color w:val="E97132" w:themeColor="accent2"/>
             </w:rPr>
-            <m:t> </m:t>
+            <m:t>n≈</m:t>
           </m:r>
-          <m:r>
-            <w:rPr>
-              <w:rFonts w:ascii="Cambria Math" w:hAnsi="Cambria Math" w:cs="Times New Roman"/>
-            </w:rPr>
-            <m:t>⋅</m:t>
-          </m:r>
-          <m:r>
-            <w:rPr>
-              <w:rFonts w:ascii="Cambria Math" w:hAnsi="Cambria Math" w:cs="Times New Roman"/>
-            </w:rPr>
-            <m:t> </m:t>
-          </m:r>
-          <m:sSup>
-            <m:sSupPr>
+          <m:f>
+            <m:fPr>
               <m:ctrlPr>
                 <w:rPr>
                   <w:rFonts w:ascii="Cambria Math" w:hAnsi="Cambria Math" w:cs="Times New Roman"/>
                   <w:i/>
+                  <w:color w:val="E97132" w:themeColor="accent2"/>
                 </w:rPr>
               </m:ctrlPr>
-            </m:sSupPr>
-            <m:e>
+            </m:fPr>
+            <m:num>
               <m:r>
                 <w:rPr>
                   <w:rFonts w:ascii="Cambria Math" w:hAnsi="Cambria Math" w:cs="Times New Roman"/>
+                  <w:color w:val="E97132" w:themeColor="accent2"/>
                 </w:rPr>
-                <m:t/>
+                <m:t>1574.64</m:t>
               </m:r>
-            </m:e>
-            <m:sup>
+            </m:num>
+            <m:den>
               <m:r>
                 <w:rPr>
                   <w:rFonts w:ascii="Cambria Math" w:hAnsi="Cambria Math" w:cs="Times New Roman"/>
+                  <w:color w:val="E97132" w:themeColor="accent2"/>
                 </w:rPr>
-                <m:t>2</m:t>
+                <m:t>4</m:t>
               </m:r>
-            </m:sup>
-          </m:sSup>
-          <m:r>
-            <m:rPr>
-              <m:sty m:val="p"/>
-            </m:rPr>
-            <w:rPr>
-              <w:rFonts w:ascii="Cambria Math" w:hAnsi="Cambria Math" w:cs="Times New Roman"/>
-            </w:rPr>
-            <m:t>MD</m:t>
-          </m:r>
-          <m:sSup>
-            <m:sSupPr>
-              <m:ctrlPr>
-                <w:rPr>
-                  <w:rFonts w:ascii="Cambria Math" w:hAnsi="Cambria Math" w:cs="Times New Roman"/>
-                  <w:i/>
-                </w:rPr>
-              </m:ctrlPr>
-            </m:sSupPr>
-            <m:e>
-              <m:r>
-                <m:rPr>
-                  <m:sty m:val="p"/>
-                </m:rPr>
-                <w:rPr>
-                  <w:rFonts w:ascii="Cambria Math" w:hAnsi="Cambria Math" w:cs="Times New Roman"/>
-                </w:rPr>
-                <m:t>E</m:t>
-              </m:r>
-              <m:ctrlPr>
-                <w:rPr>
-                  <w:rFonts w:ascii="Cambria Math" w:hAnsi="Cambria Math" w:cs="Times New Roman"/>
-                </w:rPr>
-              </m:ctrlPr>
-            </m:e>
-            <m:sup>
-              <m:r>
-                <w:rPr>
-                  <w:rFonts w:ascii="Cambria Math" w:hAnsi="Cambria Math" w:cs="Times New Roman"/>
-                </w:rPr>
-                <m:t>2</m:t>
-              </m:r>
-            </m:sup>
-          </m:sSup>
+            </m:den>
+          </m:f>
           <m:r>
             <w:rPr>
               <w:rFonts w:ascii="Cambria Math" w:hAnsi="Cambria Math" w:cs="Times New Roman"/>
+              <w:color w:val="E97132" w:themeColor="accent2"/>
             </w:rPr>
-            <m:t> </m:t>
+            <m:t>=393.66=394</m:t>
           </m:r>
-          <m:r>
-            <w:rPr>
-              <w:rFonts w:ascii="Cambria Math" w:hAnsi="Cambria Math" w:cs="Times New Roman"/>
-            </w:rPr>
-            <m:t>⋅</m:t>
-          </m:r>
-          <m:r>
-            <w:rPr>
-              <w:rFonts w:ascii="Cambria Math" w:hAnsi="Cambria Math" w:cs="Times New Roman"/>
-            </w:rPr>
-            <m:t> </m:t>
-          </m:r>
-          <m:r>
-            <m:rPr>
-              <m:sty m:val="p"/>
-            </m:rPr>
-            <w:rPr>
-              <w:rFonts w:ascii="Cambria Math" w:hAnsi="Cambria Math" w:cs="Times New Roman"/>
-            </w:rPr>
-            <m:t>P</m:t>
-          </m:r>
-          <m:d>
-            <m:dPr>
-              <m:ctrlPr>
-                <w:rPr>
-                  <w:rFonts w:ascii="Cambria Math" w:hAnsi="Cambria Math" w:cs="Times New Roman"/>
-                  <w:i/>
-                </w:rPr>
-              </m:ctrlPr>
-            </m:dPr>
-            <m:e>
-              <m:r>
-                <w:rPr>
-                  <w:rFonts w:ascii="Cambria Math" w:hAnsi="Cambria Math" w:cs="Times New Roman"/>
-                </w:rPr>
-                <m:t>1-</m:t>
-              </m:r>
-              <m:r>
-                <m:rPr>
-                  <m:sty m:val="p"/>
-                </m:rPr>
-                <w:rPr>
-                  <w:rFonts w:ascii="Cambria Math" w:hAnsi="Cambria Math" w:cs="Times New Roman"/>
-                </w:rPr>
-                <m:t>P</m:t>
-              </m:r>
-            </m:e>
-          </m:d>
         </m:oMath>
       </m:oMathPara>
     </w:p>
     <w:p>
       <w:pPr>
         <w:rPr>
-          <w:rFonts w:ascii="Times New Roman" w:hAnsi="Times New Roman" w:cs="Times New Roman"/>
-        </w:rPr>
-      </w:pPr>
-    </w:p>
-    <w:p>
-      <w:pPr>
-        <w:rPr>
-          <w:rFonts w:ascii="Times New Roman" w:hAnsi="Times New Roman" w:cs="Times New Roman"/>
-        </w:rPr>
-      </w:pPr>
-      <w:r>
-        <w:rPr>
-          <w:rFonts w:ascii="Times New Roman" w:hAnsi="Times New Roman" w:cs="Times New Roman"/>
-          <w:b/>
-          <w:bCs/>
-        </w:rPr>
-        <w:t xml:space="preserve">Question </w:t>
-      </w:r>
-      <w:r>
-        <w:rPr>
-          <w:rFonts w:ascii="Times New Roman" w:hAnsi="Times New Roman" w:cs="Times New Roman"/>
-          <w:b/>
-          <w:bCs/>
-        </w:rPr>
-        <w:t>3</w:t>
+          <w:rFonts w:ascii="Cambria Math" w:hAnsi="Cambria Math" w:cs="Times New Roman"/>
+          <w:i/>
+          <w:color w:val="E97132" w:themeColor="accent2"/>
+        </w:rPr>
+      </w:pPr>
+      <w:r>
+        <w:rPr>
+          <w:rFonts w:ascii="Cambria Math" w:hAnsi="Cambria Math" w:cs="Times New Roman"/>
+          <w:iCs/>
+          <w:color w:val="E97132" w:themeColor="accent2"/>
+        </w:rPr>
+        <w:t>Treatment</w:t>
+      </w:r>
+      <w:r>
+        <w:rPr>
+          <w:rFonts w:ascii="Cambria Math" w:hAnsi="Cambria Math" w:cs="Times New Roman"/>
+          <w:i/>
+          <w:color w:val="E97132" w:themeColor="accent2"/>
+        </w:rPr>
+        <w:t xml:space="preserve">: </w:t>
+      </w:r>
+      <m:oMath>
+        <m:sSub>
+          <m:sSubPr>
+            <m:ctrlPr>
+              <w:rPr>
+                <w:rFonts w:ascii="Cambria Math" w:hAnsi="Cambria Math" w:cs="Times New Roman"/>
+                <w:i/>
+                <w:color w:val="E97132" w:themeColor="accent2"/>
+              </w:rPr>
+            </m:ctrlPr>
+          </m:sSubPr>
+          <m:e>
+            <m:r>
+              <w:rPr>
+                <w:rFonts w:ascii="Cambria Math" w:hAnsi="Cambria Math" w:cs="Times New Roman"/>
+                <w:color w:val="E97132" w:themeColor="accent2"/>
+              </w:rPr>
+              <m:t>n</m:t>
+            </m:r>
+          </m:e>
+          <m:sub>
+            <m:r>
+              <w:rPr>
+                <w:rFonts w:ascii="Cambria Math" w:hAnsi="Cambria Math" w:cs="Times New Roman"/>
+                <w:color w:val="E97132" w:themeColor="accent2"/>
+              </w:rPr>
+              <m:t>T</m:t>
+            </m:r>
+          </m:sub>
+        </m:sSub>
+        <m:r>
+          <w:rPr>
+            <w:rFonts w:ascii="Cambria Math" w:hAnsi="Cambria Math" w:cs="Times New Roman"/>
+            <w:color w:val="E97132" w:themeColor="accent2"/>
+          </w:rPr>
+          <m:t>=0.4⋅394≈158</m:t>
+        </m:r>
+      </m:oMath>
+    </w:p>
+    <w:p>
+      <w:pPr>
+        <w:rPr>
+          <w:rFonts w:ascii="Cambria Math" w:hAnsi="Cambria Math" w:cs="Times New Roman"/>
+          <w:i/>
+          <w:color w:val="E97132" w:themeColor="accent2"/>
+        </w:rPr>
+      </w:pPr>
+      <w:r>
+        <w:rPr>
+          <w:rFonts w:ascii="Cambria Math" w:hAnsi="Cambria Math" w:cs="Times New Roman"/>
+          <w:iCs/>
+          <w:color w:val="E97132" w:themeColor="accent2"/>
+        </w:rPr>
+        <w:t>Control</w:t>
+      </w:r>
+      <w:r>
+        <w:rPr>
+          <w:rFonts w:ascii="Cambria Math" w:hAnsi="Cambria Math" w:cs="Times New Roman"/>
+          <w:i/>
+          <w:color w:val="E97132" w:themeColor="accent2"/>
+        </w:rPr>
+        <w:t xml:space="preserve">: </w:t>
+      </w:r>
+      <m:oMath>
+        <m:sSub>
+          <m:sSubPr>
+            <m:ctrlPr>
+              <w:rPr>
+                <w:rFonts w:ascii="Cambria Math" w:hAnsi="Cambria Math" w:cs="Times New Roman"/>
+                <w:i/>
+                <w:color w:val="E97132" w:themeColor="accent2"/>
+              </w:rPr>
+            </m:ctrlPr>
+          </m:sSubPr>
+          <m:e>
+            <m:r>
+              <w:rPr>
+                <w:rFonts w:ascii="Cambria Math" w:hAnsi="Cambria Math" w:cs="Times New Roman"/>
+                <w:color w:val="E97132" w:themeColor="accent2"/>
+              </w:rPr>
+              <m:t>n</m:t>
+            </m:r>
+          </m:e>
+          <m:sub>
+            <m:r>
+              <w:rPr>
+                <w:rFonts w:ascii="Cambria Math" w:hAnsi="Cambria Math" w:cs="Times New Roman"/>
+                <w:color w:val="E97132" w:themeColor="accent2"/>
+              </w:rPr>
+              <m:t>C</m:t>
+            </m:r>
+          </m:sub>
+        </m:sSub>
+        <m:r>
+          <w:rPr>
+            <w:rFonts w:ascii="Cambria Math" w:hAnsi="Cambria Math" w:cs="Times New Roman"/>
+            <w:color w:val="E97132" w:themeColor="accent2"/>
+          </w:rPr>
+          <m:t>=0.6⋅394≈236</m:t>
+        </m:r>
+      </m:oMath>
+    </w:p>
+    <w:p>
+      <w:pPr>
+        <w:rPr>
+          <w:rFonts w:ascii="Cambria Math" w:hAnsi="Cambria Math" w:cs="Times New Roman"/>
+          <w:iCs/>
+          <w:color w:val="E97132" w:themeColor="accent2"/>
+        </w:rPr>
+      </w:pPr>
+      <w:r>
+        <w:rPr>
+          <w:rFonts w:ascii="Cambria Math" w:hAnsi="Cambria Math" w:cs="Times New Roman"/>
+          <w:iCs/>
+          <w:color w:val="E97132" w:themeColor="accent2"/>
+        </w:rPr>
+        <w:t>The sample should include 394 households</w:t>
+      </w:r>
+      <w:r>
+        <w:rPr>
+          <w:rFonts w:ascii="Cambria Math" w:hAnsi="Cambria Math" w:cs="Times New Roman"/>
+          <w:iCs/>
+          <w:color w:val="E97132" w:themeColor="accent2"/>
+        </w:rPr>
+        <w:t>, 158 in the program and 236 not in the program.</w:t>
+      </w:r>
+    </w:p>
+    <w:p>
+      <w:pPr>
+        <w:rPr>
+          <w:rFonts w:ascii="Cambria Math" w:hAnsi="Cambria Math" w:cs="Times New Roman"/>
+          <w:i/>
+        </w:rPr>
+      </w:pPr>
+      <w:r>
+        <w:rPr>
+          <w:rFonts w:ascii="Cambria Math" w:hAnsi="Cambria Math" w:cs="Times New Roman"/>
+          <w:i/>
+        </w:rPr>
+        <w:br w:type="page"/>
+      </w:r>
+    </w:p>
+    <w:p>
+      <w:pPr>
+        <w:rPr>
+          <w:rFonts w:ascii="Times New Roman" w:hAnsi="Times New Roman" w:cs="Times New Roman"/>
+        </w:rPr>
+      </w:pPr>
+      <w:r>
+        <w:rPr>
+          <w:rStyle w:val="Heading3Char"/>
+        </w:rPr>
+        <w:lastRenderedPageBreak/>
+        <w:t>Question 3</w:t>
       </w:r>
       <w:r>
         <w:rPr>
@@ -3177,13 +3493,6 @@
           <w:rFonts w:ascii="Times New Roman" w:hAnsi="Times New Roman" w:cs="Times New Roman"/>
         </w:rPr>
       </w:pPr>
-    </w:p>
-    <w:p>
-      <w:pPr>
-        <w:rPr>
-          <w:rFonts w:ascii="Times New Roman" w:hAnsi="Times New Roman" w:cs="Times New Roman"/>
-        </w:rPr>
-      </w:pPr>
       <w:r>
         <w:rPr>
           <w:rFonts w:ascii="Times New Roman" w:hAnsi="Times New Roman" w:cs="Times New Roman"/>
@@ -3347,13 +3656,27 @@
         <w:rPr>
           <w:rFonts w:ascii="Times New Roman" w:hAnsi="Times New Roman" w:cs="Times New Roman"/>
         </w:rPr>
-        <w:t xml:space="preserve"> is: </w:t>
+        <w:t xml:space="preserve"> </w:t>
       </w:r>
       <w:proofErr w:type="gramStart"/>
       <w:r>
         <w:rPr>
           <w:rFonts w:ascii="Times New Roman" w:hAnsi="Times New Roman" w:cs="Times New Roman"/>
         </w:rPr>
+        <w:t>is:</w:t>
+      </w:r>
+      <w:proofErr w:type="gramEnd"/>
+      <w:r>
+        <w:rPr>
+          <w:rFonts w:ascii="Times New Roman" w:hAnsi="Times New Roman" w:cs="Times New Roman"/>
+        </w:rPr>
+        <w:t xml:space="preserve"> </w:t>
+      </w:r>
+      <w:proofErr w:type="gramStart"/>
+      <w:r>
+        <w:rPr>
+          <w:rFonts w:ascii="Times New Roman" w:hAnsi="Times New Roman" w:cs="Times New Roman"/>
+        </w:rPr>
         <w:t>E[</w:t>
       </w:r>
       <w:proofErr w:type="gramEnd"/>
@@ -3361,13 +3684,27 @@
         <w:rPr>
           <w:rFonts w:ascii="Times New Roman" w:hAnsi="Times New Roman" w:cs="Times New Roman"/>
         </w:rPr>
-        <w:t xml:space="preserve">Y | Z=1]=12. The average outcome in the control group is </w:t>
+        <w:t>Y | Z=</w:t>
       </w:r>
       <w:proofErr w:type="gramStart"/>
       <w:r>
         <w:rPr>
           <w:rFonts w:ascii="Times New Roman" w:hAnsi="Times New Roman" w:cs="Times New Roman"/>
         </w:rPr>
+        <w:t>1]=</w:t>
+      </w:r>
+      <w:proofErr w:type="gramEnd"/>
+      <w:r>
+        <w:rPr>
+          <w:rFonts w:ascii="Times New Roman" w:hAnsi="Times New Roman" w:cs="Times New Roman"/>
+        </w:rPr>
+        <w:t xml:space="preserve">12. The average outcome in the control group is </w:t>
+      </w:r>
+      <w:proofErr w:type="gramStart"/>
+      <w:r>
+        <w:rPr>
+          <w:rFonts w:ascii="Times New Roman" w:hAnsi="Times New Roman" w:cs="Times New Roman"/>
+        </w:rPr>
         <w:t>E[</w:t>
       </w:r>
       <w:proofErr w:type="gramEnd"/>
@@ -3375,7 +3712,21 @@
         <w:rPr>
           <w:rFonts w:ascii="Times New Roman" w:hAnsi="Times New Roman" w:cs="Times New Roman"/>
         </w:rPr>
-        <w:t>Y | Z=0]=10.</w:t>
+        <w:t>Y | Z=</w:t>
+      </w:r>
+      <w:proofErr w:type="gramStart"/>
+      <w:r>
+        <w:rPr>
+          <w:rFonts w:ascii="Times New Roman" w:hAnsi="Times New Roman" w:cs="Times New Roman"/>
+        </w:rPr>
+        <w:t>0]=</w:t>
+      </w:r>
+      <w:proofErr w:type="gramEnd"/>
+      <w:r>
+        <w:rPr>
+          <w:rFonts w:ascii="Times New Roman" w:hAnsi="Times New Roman" w:cs="Times New Roman"/>
+        </w:rPr>
+        <w:t>10.</w:t>
       </w:r>
     </w:p>
     <w:p>
@@ -3921,7 +4272,6 @@
         <w:rPr>
           <w:rFonts w:ascii="Times New Roman" w:hAnsi="Times New Roman" w:cs="Times New Roman"/>
         </w:rPr>
-        <w:lastRenderedPageBreak/>
         <w:t xml:space="preserve">B). </w:t>
       </w:r>
       <w:r>
@@ -4405,506 +4755,15 @@
           <w:rFonts w:ascii="Times New Roman" w:hAnsi="Times New Roman" w:cs="Times New Roman"/>
           <w:i/>
           <w:iCs/>
-          <w:lang w:val="de-DE"/>
-        </w:rPr>
-      </w:pPr>
-      <w:r>
-        <w:rPr>
-          <w:rFonts w:ascii="Times New Roman" w:hAnsi="Times New Roman" w:cs="Times New Roman"/>
-          <w:i/>
-          <w:iCs/>
-          <w:lang w:val="de-DE"/>
-        </w:rPr>
-        <w:t>gen u=rnormal()</w:t>
-      </w:r>
-    </w:p>
-    <w:p>
-      <w:pPr>
-        <w:spacing w:line="240" w:lineRule="auto"/>
-        <w:rPr>
-          <w:rFonts w:ascii="Times New Roman" w:hAnsi="Times New Roman" w:cs="Times New Roman"/>
-          <w:i/>
-          <w:iCs/>
-          <w:lang w:val="de-DE"/>
-        </w:rPr>
-      </w:pPr>
-      <w:r>
-        <w:rPr>
-          <w:rFonts w:ascii="Times New Roman" w:hAnsi="Times New Roman" w:cs="Times New Roman"/>
-          <w:i/>
-          <w:iCs/>
-          <w:lang w:val="de-DE"/>
-        </w:rPr>
-        <w:t>gen x=rnormal()</w:t>
-      </w:r>
-    </w:p>
-    <w:p>
-      <w:pPr>
-        <w:spacing w:line="240" w:lineRule="auto"/>
-        <w:rPr>
-          <w:rFonts w:ascii="Times New Roman" w:hAnsi="Times New Roman" w:cs="Times New Roman"/>
-          <w:i/>
-          <w:iCs/>
-          <w:lang w:val="de-DE"/>
-        </w:rPr>
-      </w:pPr>
-      <w:r>
-        <w:rPr>
-          <w:rFonts w:ascii="Times New Roman" w:hAnsi="Times New Roman" w:cs="Times New Roman"/>
-          <w:i/>
-          <w:iCs/>
-          <w:lang w:val="de-DE"/>
-        </w:rPr>
-        <w:t>gen d=2+2*z-x+3*u+rnormal()</w:t>
-      </w:r>
-    </w:p>
-    <w:p>
-      <w:pPr>
-        <w:spacing w:line="240" w:lineRule="auto"/>
-        <w:rPr>
-          <w:rFonts w:ascii="Times New Roman" w:hAnsi="Times New Roman" w:cs="Times New Roman"/>
-          <w:i/>
-          <w:iCs/>
-        </w:rPr>
-      </w:pPr>
-      <w:r>
-        <w:rPr>
-          <w:rFonts w:ascii="Times New Roman" w:hAnsi="Times New Roman" w:cs="Times New Roman"/>
-          <w:i/>
-          <w:iCs/>
-        </w:rPr>
-        <w:t>gen y=5+3*d+2*x+4*</w:t>
-      </w:r>
-      <w:proofErr w:type="spellStart"/>
-      <w:r>
-        <w:rPr>
-          <w:rFonts w:ascii="Times New Roman" w:hAnsi="Times New Roman" w:cs="Times New Roman"/>
-          <w:i/>
-          <w:iCs/>
-        </w:rPr>
-        <w:t>u+</w:t>
-      </w:r>
-      <w:proofErr w:type="gramStart"/>
-      <w:r>
-        <w:rPr>
-          <w:rFonts w:ascii="Times New Roman" w:hAnsi="Times New Roman" w:cs="Times New Roman"/>
-          <w:i/>
-          <w:iCs/>
-        </w:rPr>
-        <w:t>rnormal</w:t>
-      </w:r>
-      <w:proofErr w:type="spellEnd"/>
-      <w:r>
-        <w:rPr>
-          <w:rFonts w:ascii="Times New Roman" w:hAnsi="Times New Roman" w:cs="Times New Roman"/>
-          <w:i/>
-          <w:iCs/>
-        </w:rPr>
-        <w:t>(</w:t>
-      </w:r>
-      <w:proofErr w:type="gramEnd"/>
-      <w:r>
-        <w:rPr>
-          <w:rFonts w:ascii="Times New Roman" w:hAnsi="Times New Roman" w:cs="Times New Roman"/>
-          <w:i/>
-          <w:iCs/>
-        </w:rPr>
-        <w:t>)</w:t>
-      </w:r>
-    </w:p>
-    <w:p>
-      <w:pPr>
-        <w:spacing w:line="240" w:lineRule="auto"/>
-        <w:rPr>
-          <w:rFonts w:ascii="Times New Roman" w:hAnsi="Times New Roman" w:cs="Times New Roman"/>
-        </w:rPr>
-      </w:pPr>
-      <w:r>
-        <w:rPr>
-          <w:rFonts w:ascii="Times New Roman" w:hAnsi="Times New Roman" w:cs="Times New Roman"/>
-        </w:rPr>
-        <w:t xml:space="preserve">Now, </w:t>
-      </w:r>
-      <w:r>
-        <w:rPr>
-          <w:rFonts w:ascii="Times New Roman" w:hAnsi="Times New Roman" w:cs="Times New Roman"/>
-        </w:rPr>
-        <w:t>reg</w:t>
-      </w:r>
-      <w:r>
-        <w:rPr>
-          <w:rFonts w:ascii="Times New Roman" w:hAnsi="Times New Roman" w:cs="Times New Roman"/>
-        </w:rPr>
-        <w:t>ress</w:t>
-      </w:r>
-      <w:r>
-        <w:rPr>
-          <w:rFonts w:ascii="Times New Roman" w:hAnsi="Times New Roman" w:cs="Times New Roman"/>
-        </w:rPr>
-        <w:t xml:space="preserve"> y </w:t>
-      </w:r>
-      <w:r>
-        <w:rPr>
-          <w:rFonts w:ascii="Times New Roman" w:hAnsi="Times New Roman" w:cs="Times New Roman"/>
-        </w:rPr>
-        <w:t xml:space="preserve">on </w:t>
-      </w:r>
-      <w:r>
-        <w:rPr>
-          <w:rFonts w:ascii="Times New Roman" w:hAnsi="Times New Roman" w:cs="Times New Roman"/>
-        </w:rPr>
-        <w:t xml:space="preserve">d </w:t>
-      </w:r>
-      <w:r>
-        <w:rPr>
-          <w:rFonts w:ascii="Times New Roman" w:hAnsi="Times New Roman" w:cs="Times New Roman"/>
-        </w:rPr>
-        <w:t xml:space="preserve">and </w:t>
-      </w:r>
-      <w:r>
-        <w:rPr>
-          <w:rFonts w:ascii="Times New Roman" w:hAnsi="Times New Roman" w:cs="Times New Roman"/>
-        </w:rPr>
-        <w:t>x</w:t>
-      </w:r>
-      <w:r>
-        <w:rPr>
-          <w:rFonts w:ascii="Times New Roman" w:hAnsi="Times New Roman" w:cs="Times New Roman"/>
-        </w:rPr>
-        <w:t xml:space="preserve">. Is this </w:t>
-      </w:r>
-      <w:r>
-        <w:rPr>
-          <w:rFonts w:ascii="Times New Roman" w:hAnsi="Times New Roman" w:cs="Times New Roman"/>
-        </w:rPr>
-        <w:t xml:space="preserve">OLS </w:t>
-      </w:r>
-      <w:r>
-        <w:rPr>
-          <w:rFonts w:ascii="Times New Roman" w:hAnsi="Times New Roman" w:cs="Times New Roman"/>
-        </w:rPr>
-        <w:t>regression</w:t>
-      </w:r>
-      <w:r>
-        <w:rPr>
-          <w:rFonts w:ascii="Times New Roman" w:hAnsi="Times New Roman" w:cs="Times New Roman"/>
-        </w:rPr>
-        <w:t xml:space="preserve"> biased</w:t>
-      </w:r>
-      <w:r>
-        <w:rPr>
-          <w:rFonts w:ascii="Times New Roman" w:hAnsi="Times New Roman" w:cs="Times New Roman"/>
-        </w:rPr>
-        <w:t>? Why or why not?</w:t>
-      </w:r>
-    </w:p>
-    <w:p>
-      <w:pPr>
-        <w:rPr>
-          <w:rFonts w:ascii="Times New Roman" w:hAnsi="Times New Roman" w:cs="Times New Roman"/>
-        </w:rPr>
-      </w:pPr>
-    </w:p>
-    <w:p>
-      <w:pPr>
-        <w:rPr>
-          <w:rFonts w:ascii="Times New Roman" w:hAnsi="Times New Roman" w:cs="Times New Roman"/>
-        </w:rPr>
-      </w:pPr>
-      <w:r>
-        <w:rPr>
-          <w:rFonts w:ascii="Times New Roman" w:hAnsi="Times New Roman" w:cs="Times New Roman"/>
-        </w:rPr>
-        <w:t xml:space="preserve">B). Estimate the relationship </w:t>
-      </w:r>
-      <w:r>
-        <w:rPr>
-          <w:rFonts w:ascii="Times New Roman" w:hAnsi="Times New Roman" w:cs="Times New Roman"/>
-        </w:rPr>
-        <w:t xml:space="preserve">y </w:t>
-      </w:r>
-      <w:r>
-        <w:rPr>
-          <w:rFonts w:ascii="Times New Roman" w:hAnsi="Times New Roman" w:cs="Times New Roman"/>
-        </w:rPr>
-        <w:t xml:space="preserve">= </w:t>
-      </w:r>
-      <w:r>
-        <w:rPr>
-          <w:rFonts w:ascii="Times New Roman" w:hAnsi="Times New Roman" w:cs="Times New Roman"/>
-        </w:rPr>
-        <w:t xml:space="preserve">d </w:t>
-      </w:r>
-      <w:r>
-        <w:rPr>
-          <w:rFonts w:ascii="Times New Roman" w:hAnsi="Times New Roman" w:cs="Times New Roman"/>
-        </w:rPr>
-        <w:t xml:space="preserve">+ </w:t>
-      </w:r>
-      <w:r>
-        <w:rPr>
-          <w:rFonts w:ascii="Times New Roman" w:hAnsi="Times New Roman" w:cs="Times New Roman"/>
-        </w:rPr>
-        <w:t>x</w:t>
-      </w:r>
-      <w:r>
-        <w:rPr>
-          <w:rFonts w:ascii="Times New Roman" w:hAnsi="Times New Roman" w:cs="Times New Roman"/>
-        </w:rPr>
-        <w:t xml:space="preserve"> using the </w:t>
-      </w:r>
-      <w:r>
-        <w:rPr>
-          <w:rFonts w:ascii="Times New Roman" w:hAnsi="Times New Roman" w:cs="Times New Roman"/>
-        </w:rPr>
-        <w:t>IV</w:t>
-      </w:r>
-      <w:r>
-        <w:rPr>
-          <w:rFonts w:ascii="Times New Roman" w:hAnsi="Times New Roman" w:cs="Times New Roman"/>
-        </w:rPr>
-        <w:t xml:space="preserve"> command, </w:t>
-      </w:r>
-      <w:proofErr w:type="spellStart"/>
-      <w:r>
-        <w:rPr>
-          <w:rFonts w:ascii="Times New Roman" w:hAnsi="Times New Roman" w:cs="Times New Roman"/>
-          <w:i/>
-          <w:iCs/>
-        </w:rPr>
-        <w:t>ivregress</w:t>
-      </w:r>
-      <w:proofErr w:type="spellEnd"/>
-      <w:r>
-        <w:rPr>
-          <w:rFonts w:ascii="Times New Roman" w:hAnsi="Times New Roman" w:cs="Times New Roman"/>
-        </w:rPr>
-        <w:t xml:space="preserve">. Screenshot and paste your results here. </w:t>
-      </w:r>
-      <w:r>
-        <w:rPr>
-          <w:rFonts w:ascii="Times New Roman" w:hAnsi="Times New Roman" w:cs="Times New Roman"/>
-        </w:rPr>
-        <w:t>(</w:t>
-      </w:r>
-      <w:r>
-        <w:rPr>
-          <w:rFonts w:ascii="Times New Roman" w:hAnsi="Times New Roman" w:cs="Times New Roman"/>
-        </w:rPr>
-        <w:t>Hint: I showed this in class.</w:t>
-      </w:r>
-      <w:r>
-        <w:rPr>
-          <w:rFonts w:ascii="Times New Roman" w:hAnsi="Times New Roman" w:cs="Times New Roman"/>
-        </w:rPr>
-        <w:t>)</w:t>
-      </w:r>
-      <w:r>
-        <w:rPr>
-          <w:rFonts w:ascii="Times New Roman" w:hAnsi="Times New Roman" w:cs="Times New Roman"/>
-        </w:rPr>
-        <w:t xml:space="preserve"> </w:t>
-      </w:r>
-    </w:p>
-    <w:p>
-      <w:pPr>
-        <w:rPr>
-          <w:rFonts w:ascii="Times New Roman" w:hAnsi="Times New Roman" w:cs="Times New Roman"/>
-        </w:rPr>
-      </w:pPr>
-    </w:p>
-    <w:p>
-      <w:pPr>
-        <w:rPr>
-          <w:rFonts w:ascii="Times New Roman" w:hAnsi="Times New Roman" w:cs="Times New Roman"/>
-        </w:rPr>
-      </w:pPr>
-      <w:r>
-        <w:rPr>
-          <w:rFonts w:ascii="Times New Roman" w:hAnsi="Times New Roman" w:cs="Times New Roman"/>
-        </w:rPr>
-        <w:t xml:space="preserve">C). How are the estimates using the </w:t>
-      </w:r>
-      <w:r>
-        <w:rPr>
-          <w:rFonts w:ascii="Times New Roman" w:hAnsi="Times New Roman" w:cs="Times New Roman"/>
-        </w:rPr>
-        <w:t>IV</w:t>
-      </w:r>
-      <w:r>
-        <w:rPr>
-          <w:rFonts w:ascii="Times New Roman" w:hAnsi="Times New Roman" w:cs="Times New Roman"/>
-        </w:rPr>
-        <w:t xml:space="preserve"> command</w:t>
-      </w:r>
-      <w:r>
-        <w:rPr>
-          <w:rFonts w:ascii="Times New Roman" w:hAnsi="Times New Roman" w:cs="Times New Roman"/>
-        </w:rPr>
-        <w:t xml:space="preserve"> </w:t>
-      </w:r>
-      <w:r>
-        <w:rPr>
-          <w:rFonts w:ascii="Times New Roman" w:hAnsi="Times New Roman" w:cs="Times New Roman"/>
-        </w:rPr>
-        <w:t xml:space="preserve">compared to those using </w:t>
-      </w:r>
-      <w:r>
-        <w:rPr>
-          <w:rFonts w:ascii="Times New Roman" w:hAnsi="Times New Roman" w:cs="Times New Roman"/>
-        </w:rPr>
-        <w:t xml:space="preserve">OLS </w:t>
-      </w:r>
-      <w:r>
-        <w:rPr>
-          <w:rFonts w:ascii="Times New Roman" w:hAnsi="Times New Roman" w:cs="Times New Roman"/>
-        </w:rPr>
-        <w:t>regression? Is this IV</w:t>
-      </w:r>
-      <w:r>
-        <w:rPr>
-          <w:rFonts w:ascii="Times New Roman" w:hAnsi="Times New Roman" w:cs="Times New Roman"/>
-        </w:rPr>
-        <w:t xml:space="preserve"> </w:t>
-      </w:r>
-      <w:r>
-        <w:rPr>
-          <w:rFonts w:ascii="Times New Roman" w:hAnsi="Times New Roman" w:cs="Times New Roman"/>
-        </w:rPr>
-        <w:t>regression</w:t>
-      </w:r>
-      <w:r>
-        <w:rPr>
-          <w:rFonts w:ascii="Times New Roman" w:hAnsi="Times New Roman" w:cs="Times New Roman"/>
-        </w:rPr>
-        <w:t xml:space="preserve"> </w:t>
-      </w:r>
-      <w:r>
-        <w:rPr>
-          <w:rFonts w:ascii="Times New Roman" w:hAnsi="Times New Roman" w:cs="Times New Roman"/>
-        </w:rPr>
-        <w:t xml:space="preserve">using </w:t>
-      </w:r>
-      <w:proofErr w:type="spellStart"/>
-      <w:r>
-        <w:rPr>
-          <w:rFonts w:ascii="Times New Roman" w:hAnsi="Times New Roman" w:cs="Times New Roman"/>
-          <w:i/>
-          <w:iCs/>
-        </w:rPr>
-        <w:t>ivregress</w:t>
-      </w:r>
-      <w:proofErr w:type="spellEnd"/>
-      <w:r>
-        <w:rPr>
-          <w:rFonts w:ascii="Times New Roman" w:hAnsi="Times New Roman" w:cs="Times New Roman"/>
-        </w:rPr>
-        <w:t xml:space="preserve"> biased</w:t>
-      </w:r>
-      <w:r>
-        <w:rPr>
-          <w:rFonts w:ascii="Times New Roman" w:hAnsi="Times New Roman" w:cs="Times New Roman"/>
-        </w:rPr>
-        <w:t>?</w:t>
-      </w:r>
-      <w:r>
-        <w:rPr>
-          <w:rFonts w:ascii="Times New Roman" w:hAnsi="Times New Roman" w:cs="Times New Roman"/>
-        </w:rPr>
-        <w:t xml:space="preserve"> Why or why not?</w:t>
-      </w:r>
-    </w:p>
-    <w:p>
-      <w:pPr>
-        <w:rPr>
-          <w:rFonts w:ascii="Times New Roman" w:hAnsi="Times New Roman" w:cs="Times New Roman"/>
-        </w:rPr>
-      </w:pPr>
-    </w:p>
-    <w:p>
-      <w:pPr>
-        <w:spacing w:line="240" w:lineRule="auto"/>
-        <w:rPr>
-          <w:rFonts w:ascii="Times New Roman" w:hAnsi="Times New Roman" w:cs="Times New Roman"/>
-        </w:rPr>
-      </w:pPr>
-      <w:r>
-        <w:rPr>
-          <w:rFonts w:ascii="Times New Roman" w:hAnsi="Times New Roman" w:cs="Times New Roman"/>
-        </w:rPr>
-        <w:t>D). Run the following block of commands in STATA.</w:t>
-      </w:r>
-    </w:p>
-    <w:p>
-      <w:pPr>
-        <w:spacing w:line="240" w:lineRule="auto"/>
-        <w:rPr>
-          <w:rFonts w:ascii="Times New Roman" w:hAnsi="Times New Roman" w:cs="Times New Roman"/>
-          <w:i/>
-          <w:iCs/>
-        </w:rPr>
-      </w:pPr>
-      <w:r>
-        <w:rPr>
-          <w:rFonts w:ascii="Times New Roman" w:hAnsi="Times New Roman" w:cs="Times New Roman"/>
-          <w:i/>
-          <w:iCs/>
-        </w:rPr>
-        <w:t>clear</w:t>
-      </w:r>
-    </w:p>
-    <w:p>
-      <w:pPr>
-        <w:spacing w:line="240" w:lineRule="auto"/>
-        <w:rPr>
-          <w:rFonts w:ascii="Times New Roman" w:hAnsi="Times New Roman" w:cs="Times New Roman"/>
-          <w:i/>
-          <w:iCs/>
-        </w:rPr>
-      </w:pPr>
-      <w:r>
-        <w:rPr>
-          <w:rFonts w:ascii="Times New Roman" w:hAnsi="Times New Roman" w:cs="Times New Roman"/>
-          <w:i/>
-          <w:iCs/>
-        </w:rPr>
-        <w:t xml:space="preserve">set </w:t>
-      </w:r>
-      <w:proofErr w:type="spellStart"/>
-      <w:r>
-        <w:rPr>
-          <w:rFonts w:ascii="Times New Roman" w:hAnsi="Times New Roman" w:cs="Times New Roman"/>
-          <w:i/>
-          <w:iCs/>
-        </w:rPr>
-        <w:t>obs</w:t>
-      </w:r>
-      <w:proofErr w:type="spellEnd"/>
-      <w:r>
-        <w:rPr>
-          <w:rFonts w:ascii="Times New Roman" w:hAnsi="Times New Roman" w:cs="Times New Roman"/>
-          <w:i/>
-          <w:iCs/>
-        </w:rPr>
-        <w:t xml:space="preserve"> 1000</w:t>
-      </w:r>
-    </w:p>
-    <w:p>
-      <w:pPr>
-        <w:spacing w:line="240" w:lineRule="auto"/>
-        <w:rPr>
-          <w:rFonts w:ascii="Times New Roman" w:hAnsi="Times New Roman" w:cs="Times New Roman"/>
-          <w:i/>
-          <w:iCs/>
-        </w:rPr>
-      </w:pPr>
-      <w:r>
-        <w:rPr>
-          <w:rFonts w:ascii="Times New Roman" w:hAnsi="Times New Roman" w:cs="Times New Roman"/>
-          <w:i/>
-          <w:iCs/>
-        </w:rPr>
-        <w:t>gen z=</w:t>
+        </w:rPr>
+      </w:pPr>
+      <w:r>
+        <w:rPr>
+          <w:rFonts w:ascii="Times New Roman" w:hAnsi="Times New Roman" w:cs="Times New Roman"/>
+          <w:i/>
+          <w:iCs/>
+        </w:rPr>
+        <w:t>gen u=</w:t>
       </w:r>
       <w:proofErr w:type="spellStart"/>
       <w:proofErr w:type="gramStart"/>
@@ -4952,7 +4811,7 @@
           <w:iCs/>
           <w:lang w:val="de-DE"/>
         </w:rPr>
-        <w:t>gen u=rnormal()</w:t>
+        <w:t>gen x=rnormal()</w:t>
       </w:r>
     </w:p>
     <w:p>
@@ -4972,6 +4831,550 @@
           <w:iCs/>
           <w:lang w:val="de-DE"/>
         </w:rPr>
+        <w:t>gen d=2+2*z-x+3*u+rnormal()</w:t>
+      </w:r>
+    </w:p>
+    <w:p>
+      <w:pPr>
+        <w:spacing w:line="240" w:lineRule="auto"/>
+        <w:rPr>
+          <w:rFonts w:ascii="Times New Roman" w:hAnsi="Times New Roman" w:cs="Times New Roman"/>
+          <w:i/>
+          <w:iCs/>
+        </w:rPr>
+      </w:pPr>
+      <w:r>
+        <w:rPr>
+          <w:rFonts w:ascii="Times New Roman" w:hAnsi="Times New Roman" w:cs="Times New Roman"/>
+          <w:i/>
+          <w:iCs/>
+        </w:rPr>
+        <w:t>gen y=5+3*d+2*x+4*</w:t>
+      </w:r>
+      <w:proofErr w:type="spellStart"/>
+      <w:r>
+        <w:rPr>
+          <w:rFonts w:ascii="Times New Roman" w:hAnsi="Times New Roman" w:cs="Times New Roman"/>
+          <w:i/>
+          <w:iCs/>
+        </w:rPr>
+        <w:t>u+</w:t>
+      </w:r>
+      <w:proofErr w:type="gramStart"/>
+      <w:r>
+        <w:rPr>
+          <w:rFonts w:ascii="Times New Roman" w:hAnsi="Times New Roman" w:cs="Times New Roman"/>
+          <w:i/>
+          <w:iCs/>
+        </w:rPr>
+        <w:t>rnormal</w:t>
+      </w:r>
+      <w:proofErr w:type="spellEnd"/>
+      <w:r>
+        <w:rPr>
+          <w:rFonts w:ascii="Times New Roman" w:hAnsi="Times New Roman" w:cs="Times New Roman"/>
+          <w:i/>
+          <w:iCs/>
+        </w:rPr>
+        <w:t>(</w:t>
+      </w:r>
+      <w:proofErr w:type="gramEnd"/>
+      <w:r>
+        <w:rPr>
+          <w:rFonts w:ascii="Times New Roman" w:hAnsi="Times New Roman" w:cs="Times New Roman"/>
+          <w:i/>
+          <w:iCs/>
+        </w:rPr>
+        <w:t>)</w:t>
+      </w:r>
+    </w:p>
+    <w:p>
+      <w:pPr>
+        <w:spacing w:line="240" w:lineRule="auto"/>
+        <w:rPr>
+          <w:rFonts w:ascii="Times New Roman" w:hAnsi="Times New Roman" w:cs="Times New Roman"/>
+        </w:rPr>
+      </w:pPr>
+      <w:r>
+        <w:rPr>
+          <w:rFonts w:ascii="Times New Roman" w:hAnsi="Times New Roman" w:cs="Times New Roman"/>
+        </w:rPr>
+        <w:t xml:space="preserve">Now, </w:t>
+      </w:r>
+      <w:r>
+        <w:rPr>
+          <w:rFonts w:ascii="Times New Roman" w:hAnsi="Times New Roman" w:cs="Times New Roman"/>
+        </w:rPr>
+        <w:t>reg</w:t>
+      </w:r>
+      <w:r>
+        <w:rPr>
+          <w:rFonts w:ascii="Times New Roman" w:hAnsi="Times New Roman" w:cs="Times New Roman"/>
+        </w:rPr>
+        <w:t>ress</w:t>
+      </w:r>
+      <w:r>
+        <w:rPr>
+          <w:rFonts w:ascii="Times New Roman" w:hAnsi="Times New Roman" w:cs="Times New Roman"/>
+        </w:rPr>
+        <w:t xml:space="preserve"> y </w:t>
+      </w:r>
+      <w:r>
+        <w:rPr>
+          <w:rFonts w:ascii="Times New Roman" w:hAnsi="Times New Roman" w:cs="Times New Roman"/>
+        </w:rPr>
+        <w:t xml:space="preserve">on </w:t>
+      </w:r>
+      <w:r>
+        <w:rPr>
+          <w:rFonts w:ascii="Times New Roman" w:hAnsi="Times New Roman" w:cs="Times New Roman"/>
+        </w:rPr>
+        <w:t xml:space="preserve">d </w:t>
+      </w:r>
+      <w:r>
+        <w:rPr>
+          <w:rFonts w:ascii="Times New Roman" w:hAnsi="Times New Roman" w:cs="Times New Roman"/>
+        </w:rPr>
+        <w:t xml:space="preserve">and </w:t>
+      </w:r>
+      <w:r>
+        <w:rPr>
+          <w:rFonts w:ascii="Times New Roman" w:hAnsi="Times New Roman" w:cs="Times New Roman"/>
+        </w:rPr>
+        <w:t>x</w:t>
+      </w:r>
+      <w:r>
+        <w:rPr>
+          <w:rFonts w:ascii="Times New Roman" w:hAnsi="Times New Roman" w:cs="Times New Roman"/>
+        </w:rPr>
+        <w:t xml:space="preserve">. Is this </w:t>
+      </w:r>
+      <w:r>
+        <w:rPr>
+          <w:rFonts w:ascii="Times New Roman" w:hAnsi="Times New Roman" w:cs="Times New Roman"/>
+        </w:rPr>
+        <w:t xml:space="preserve">OLS </w:t>
+      </w:r>
+      <w:r>
+        <w:rPr>
+          <w:rFonts w:ascii="Times New Roman" w:hAnsi="Times New Roman" w:cs="Times New Roman"/>
+        </w:rPr>
+        <w:t>regression</w:t>
+      </w:r>
+      <w:r>
+        <w:rPr>
+          <w:rFonts w:ascii="Times New Roman" w:hAnsi="Times New Roman" w:cs="Times New Roman"/>
+        </w:rPr>
+        <w:t xml:space="preserve"> biased</w:t>
+      </w:r>
+      <w:r>
+        <w:rPr>
+          <w:rFonts w:ascii="Times New Roman" w:hAnsi="Times New Roman" w:cs="Times New Roman"/>
+        </w:rPr>
+        <w:t>? Why or why not?</w:t>
+      </w:r>
+    </w:p>
+    <w:p>
+      <w:pPr>
+        <w:rPr>
+          <w:rFonts w:ascii="Times New Roman" w:hAnsi="Times New Roman" w:cs="Times New Roman"/>
+        </w:rPr>
+      </w:pPr>
+    </w:p>
+    <w:p>
+      <w:pPr>
+        <w:rPr>
+          <w:rFonts w:ascii="Times New Roman" w:hAnsi="Times New Roman" w:cs="Times New Roman"/>
+        </w:rPr>
+      </w:pPr>
+      <w:r>
+        <w:rPr>
+          <w:rFonts w:ascii="Times New Roman" w:hAnsi="Times New Roman" w:cs="Times New Roman"/>
+        </w:rPr>
+        <w:lastRenderedPageBreak/>
+        <w:t xml:space="preserve">B). Estimate the relationship </w:t>
+      </w:r>
+      <w:r>
+        <w:rPr>
+          <w:rFonts w:ascii="Times New Roman" w:hAnsi="Times New Roman" w:cs="Times New Roman"/>
+        </w:rPr>
+        <w:t xml:space="preserve">y </w:t>
+      </w:r>
+      <w:r>
+        <w:rPr>
+          <w:rFonts w:ascii="Times New Roman" w:hAnsi="Times New Roman" w:cs="Times New Roman"/>
+        </w:rPr>
+        <w:t xml:space="preserve">= </w:t>
+      </w:r>
+      <w:r>
+        <w:rPr>
+          <w:rFonts w:ascii="Times New Roman" w:hAnsi="Times New Roman" w:cs="Times New Roman"/>
+        </w:rPr>
+        <w:t xml:space="preserve">d </w:t>
+      </w:r>
+      <w:r>
+        <w:rPr>
+          <w:rFonts w:ascii="Times New Roman" w:hAnsi="Times New Roman" w:cs="Times New Roman"/>
+        </w:rPr>
+        <w:t xml:space="preserve">+ </w:t>
+      </w:r>
+      <w:r>
+        <w:rPr>
+          <w:rFonts w:ascii="Times New Roman" w:hAnsi="Times New Roman" w:cs="Times New Roman"/>
+        </w:rPr>
+        <w:t>x</w:t>
+      </w:r>
+      <w:r>
+        <w:rPr>
+          <w:rFonts w:ascii="Times New Roman" w:hAnsi="Times New Roman" w:cs="Times New Roman"/>
+        </w:rPr>
+        <w:t xml:space="preserve"> using the </w:t>
+      </w:r>
+      <w:r>
+        <w:rPr>
+          <w:rFonts w:ascii="Times New Roman" w:hAnsi="Times New Roman" w:cs="Times New Roman"/>
+        </w:rPr>
+        <w:t>IV</w:t>
+      </w:r>
+      <w:r>
+        <w:rPr>
+          <w:rFonts w:ascii="Times New Roman" w:hAnsi="Times New Roman" w:cs="Times New Roman"/>
+        </w:rPr>
+        <w:t xml:space="preserve"> command, </w:t>
+      </w:r>
+      <w:proofErr w:type="spellStart"/>
+      <w:r>
+        <w:rPr>
+          <w:rFonts w:ascii="Times New Roman" w:hAnsi="Times New Roman" w:cs="Times New Roman"/>
+          <w:i/>
+          <w:iCs/>
+        </w:rPr>
+        <w:t>ivregress</w:t>
+      </w:r>
+      <w:proofErr w:type="spellEnd"/>
+      <w:r>
+        <w:rPr>
+          <w:rFonts w:ascii="Times New Roman" w:hAnsi="Times New Roman" w:cs="Times New Roman"/>
+        </w:rPr>
+        <w:t xml:space="preserve">. Screenshot and paste your results here. </w:t>
+      </w:r>
+      <w:r>
+        <w:rPr>
+          <w:rFonts w:ascii="Times New Roman" w:hAnsi="Times New Roman" w:cs="Times New Roman"/>
+        </w:rPr>
+        <w:t>(</w:t>
+      </w:r>
+      <w:r>
+        <w:rPr>
+          <w:rFonts w:ascii="Times New Roman" w:hAnsi="Times New Roman" w:cs="Times New Roman"/>
+        </w:rPr>
+        <w:t>Hint: I showed this in class.</w:t>
+      </w:r>
+      <w:r>
+        <w:rPr>
+          <w:rFonts w:ascii="Times New Roman" w:hAnsi="Times New Roman" w:cs="Times New Roman"/>
+        </w:rPr>
+        <w:t>)</w:t>
+      </w:r>
+      <w:r>
+        <w:rPr>
+          <w:rFonts w:ascii="Times New Roman" w:hAnsi="Times New Roman" w:cs="Times New Roman"/>
+        </w:rPr>
+        <w:t xml:space="preserve"> </w:t>
+      </w:r>
+    </w:p>
+    <w:p>
+      <w:pPr>
+        <w:rPr>
+          <w:rFonts w:ascii="Times New Roman" w:hAnsi="Times New Roman" w:cs="Times New Roman"/>
+        </w:rPr>
+      </w:pPr>
+    </w:p>
+    <w:p>
+      <w:pPr>
+        <w:rPr>
+          <w:rFonts w:ascii="Times New Roman" w:hAnsi="Times New Roman" w:cs="Times New Roman"/>
+        </w:rPr>
+      </w:pPr>
+      <w:r>
+        <w:rPr>
+          <w:rFonts w:ascii="Times New Roman" w:hAnsi="Times New Roman" w:cs="Times New Roman"/>
+        </w:rPr>
+        <w:t xml:space="preserve">C). How are the estimates using the </w:t>
+      </w:r>
+      <w:r>
+        <w:rPr>
+          <w:rFonts w:ascii="Times New Roman" w:hAnsi="Times New Roman" w:cs="Times New Roman"/>
+        </w:rPr>
+        <w:t>IV</w:t>
+      </w:r>
+      <w:r>
+        <w:rPr>
+          <w:rFonts w:ascii="Times New Roman" w:hAnsi="Times New Roman" w:cs="Times New Roman"/>
+        </w:rPr>
+        <w:t xml:space="preserve"> command</w:t>
+      </w:r>
+      <w:r>
+        <w:rPr>
+          <w:rFonts w:ascii="Times New Roman" w:hAnsi="Times New Roman" w:cs="Times New Roman"/>
+        </w:rPr>
+        <w:t xml:space="preserve"> </w:t>
+      </w:r>
+      <w:r>
+        <w:rPr>
+          <w:rFonts w:ascii="Times New Roman" w:hAnsi="Times New Roman" w:cs="Times New Roman"/>
+        </w:rPr>
+        <w:t xml:space="preserve">compared to those using </w:t>
+      </w:r>
+      <w:r>
+        <w:rPr>
+          <w:rFonts w:ascii="Times New Roman" w:hAnsi="Times New Roman" w:cs="Times New Roman"/>
+        </w:rPr>
+        <w:t xml:space="preserve">OLS </w:t>
+      </w:r>
+      <w:r>
+        <w:rPr>
+          <w:rFonts w:ascii="Times New Roman" w:hAnsi="Times New Roman" w:cs="Times New Roman"/>
+        </w:rPr>
+        <w:t>regression? Is this IV</w:t>
+      </w:r>
+      <w:r>
+        <w:rPr>
+          <w:rFonts w:ascii="Times New Roman" w:hAnsi="Times New Roman" w:cs="Times New Roman"/>
+        </w:rPr>
+        <w:t xml:space="preserve"> </w:t>
+      </w:r>
+      <w:r>
+        <w:rPr>
+          <w:rFonts w:ascii="Times New Roman" w:hAnsi="Times New Roman" w:cs="Times New Roman"/>
+        </w:rPr>
+        <w:t>regression</w:t>
+      </w:r>
+      <w:r>
+        <w:rPr>
+          <w:rFonts w:ascii="Times New Roman" w:hAnsi="Times New Roman" w:cs="Times New Roman"/>
+        </w:rPr>
+        <w:t xml:space="preserve"> </w:t>
+      </w:r>
+      <w:r>
+        <w:rPr>
+          <w:rFonts w:ascii="Times New Roman" w:hAnsi="Times New Roman" w:cs="Times New Roman"/>
+        </w:rPr>
+        <w:t xml:space="preserve">using </w:t>
+      </w:r>
+      <w:proofErr w:type="spellStart"/>
+      <w:r>
+        <w:rPr>
+          <w:rFonts w:ascii="Times New Roman" w:hAnsi="Times New Roman" w:cs="Times New Roman"/>
+          <w:i/>
+          <w:iCs/>
+        </w:rPr>
+        <w:t>ivregress</w:t>
+      </w:r>
+      <w:proofErr w:type="spellEnd"/>
+      <w:r>
+        <w:rPr>
+          <w:rFonts w:ascii="Times New Roman" w:hAnsi="Times New Roman" w:cs="Times New Roman"/>
+        </w:rPr>
+        <w:t xml:space="preserve"> biased</w:t>
+      </w:r>
+      <w:r>
+        <w:rPr>
+          <w:rFonts w:ascii="Times New Roman" w:hAnsi="Times New Roman" w:cs="Times New Roman"/>
+        </w:rPr>
+        <w:t>?</w:t>
+      </w:r>
+      <w:r>
+        <w:rPr>
+          <w:rFonts w:ascii="Times New Roman" w:hAnsi="Times New Roman" w:cs="Times New Roman"/>
+        </w:rPr>
+        <w:t xml:space="preserve"> Why or why not?</w:t>
+      </w:r>
+    </w:p>
+    <w:p>
+      <w:pPr>
+        <w:rPr>
+          <w:rFonts w:ascii="Times New Roman" w:hAnsi="Times New Roman" w:cs="Times New Roman"/>
+        </w:rPr>
+      </w:pPr>
+    </w:p>
+    <w:p>
+      <w:pPr>
+        <w:spacing w:line="240" w:lineRule="auto"/>
+        <w:rPr>
+          <w:rFonts w:ascii="Times New Roman" w:hAnsi="Times New Roman" w:cs="Times New Roman"/>
+        </w:rPr>
+      </w:pPr>
+      <w:r>
+        <w:rPr>
+          <w:rFonts w:ascii="Times New Roman" w:hAnsi="Times New Roman" w:cs="Times New Roman"/>
+        </w:rPr>
+        <w:t>D). Run the following block of commands in STATA.</w:t>
+      </w:r>
+    </w:p>
+    <w:p>
+      <w:pPr>
+        <w:spacing w:line="240" w:lineRule="auto"/>
+        <w:rPr>
+          <w:rFonts w:ascii="Times New Roman" w:hAnsi="Times New Roman" w:cs="Times New Roman"/>
+          <w:i/>
+          <w:iCs/>
+        </w:rPr>
+      </w:pPr>
+      <w:r>
+        <w:rPr>
+          <w:rFonts w:ascii="Times New Roman" w:hAnsi="Times New Roman" w:cs="Times New Roman"/>
+          <w:i/>
+          <w:iCs/>
+        </w:rPr>
+        <w:t>clear</w:t>
+      </w:r>
+    </w:p>
+    <w:p>
+      <w:pPr>
+        <w:spacing w:line="240" w:lineRule="auto"/>
+        <w:rPr>
+          <w:rFonts w:ascii="Times New Roman" w:hAnsi="Times New Roman" w:cs="Times New Roman"/>
+          <w:i/>
+          <w:iCs/>
+        </w:rPr>
+      </w:pPr>
+      <w:r>
+        <w:rPr>
+          <w:rFonts w:ascii="Times New Roman" w:hAnsi="Times New Roman" w:cs="Times New Roman"/>
+          <w:i/>
+          <w:iCs/>
+        </w:rPr>
+        <w:t xml:space="preserve">set </w:t>
+      </w:r>
+      <w:proofErr w:type="spellStart"/>
+      <w:r>
+        <w:rPr>
+          <w:rFonts w:ascii="Times New Roman" w:hAnsi="Times New Roman" w:cs="Times New Roman"/>
+          <w:i/>
+          <w:iCs/>
+        </w:rPr>
+        <w:t>obs</w:t>
+      </w:r>
+      <w:proofErr w:type="spellEnd"/>
+      <w:r>
+        <w:rPr>
+          <w:rFonts w:ascii="Times New Roman" w:hAnsi="Times New Roman" w:cs="Times New Roman"/>
+          <w:i/>
+          <w:iCs/>
+        </w:rPr>
+        <w:t xml:space="preserve"> 1000</w:t>
+      </w:r>
+    </w:p>
+    <w:p>
+      <w:pPr>
+        <w:spacing w:line="240" w:lineRule="auto"/>
+        <w:rPr>
+          <w:rFonts w:ascii="Times New Roman" w:hAnsi="Times New Roman" w:cs="Times New Roman"/>
+          <w:i/>
+          <w:iCs/>
+        </w:rPr>
+      </w:pPr>
+      <w:r>
+        <w:rPr>
+          <w:rFonts w:ascii="Times New Roman" w:hAnsi="Times New Roman" w:cs="Times New Roman"/>
+          <w:i/>
+          <w:iCs/>
+        </w:rPr>
+        <w:t>gen z=</w:t>
+      </w:r>
+      <w:proofErr w:type="spellStart"/>
+      <w:proofErr w:type="gramStart"/>
+      <w:r>
+        <w:rPr>
+          <w:rFonts w:ascii="Times New Roman" w:hAnsi="Times New Roman" w:cs="Times New Roman"/>
+          <w:i/>
+          <w:iCs/>
+        </w:rPr>
+        <w:t>rnormal</w:t>
+      </w:r>
+      <w:proofErr w:type="spellEnd"/>
+      <w:r>
+        <w:rPr>
+          <w:rFonts w:ascii="Times New Roman" w:hAnsi="Times New Roman" w:cs="Times New Roman"/>
+          <w:i/>
+          <w:iCs/>
+        </w:rPr>
+        <w:t>(</w:t>
+      </w:r>
+      <w:proofErr w:type="gramEnd"/>
+      <w:r>
+        <w:rPr>
+          <w:rFonts w:ascii="Times New Roman" w:hAnsi="Times New Roman" w:cs="Times New Roman"/>
+          <w:i/>
+          <w:iCs/>
+        </w:rPr>
+        <w:t>)</w:t>
+      </w:r>
+    </w:p>
+    <w:p>
+      <w:pPr>
+        <w:spacing w:line="240" w:lineRule="auto"/>
+        <w:rPr>
+          <w:rFonts w:ascii="Times New Roman" w:hAnsi="Times New Roman" w:cs="Times New Roman"/>
+          <w:i/>
+          <w:iCs/>
+        </w:rPr>
+      </w:pPr>
+      <w:r>
+        <w:rPr>
+          <w:rFonts w:ascii="Times New Roman" w:hAnsi="Times New Roman" w:cs="Times New Roman"/>
+          <w:i/>
+          <w:iCs/>
+        </w:rPr>
+        <w:t>gen u=</w:t>
+      </w:r>
+      <w:proofErr w:type="spellStart"/>
+      <w:proofErr w:type="gramStart"/>
+      <w:r>
+        <w:rPr>
+          <w:rFonts w:ascii="Times New Roman" w:hAnsi="Times New Roman" w:cs="Times New Roman"/>
+          <w:i/>
+          <w:iCs/>
+        </w:rPr>
+        <w:t>rnormal</w:t>
+      </w:r>
+      <w:proofErr w:type="spellEnd"/>
+      <w:r>
+        <w:rPr>
+          <w:rFonts w:ascii="Times New Roman" w:hAnsi="Times New Roman" w:cs="Times New Roman"/>
+          <w:i/>
+          <w:iCs/>
+        </w:rPr>
+        <w:t>(</w:t>
+      </w:r>
+      <w:proofErr w:type="gramEnd"/>
+      <w:r>
+        <w:rPr>
+          <w:rFonts w:ascii="Times New Roman" w:hAnsi="Times New Roman" w:cs="Times New Roman"/>
+          <w:i/>
+          <w:iCs/>
+        </w:rPr>
+        <w:t>)</w:t>
+      </w:r>
+    </w:p>
+    <w:p>
+      <w:pPr>
+        <w:spacing w:line="240" w:lineRule="auto"/>
+        <w:rPr>
+          <w:rFonts w:ascii="Times New Roman" w:hAnsi="Times New Roman" w:cs="Times New Roman"/>
+          <w:i/>
+          <w:iCs/>
+          <w:lang w:val="de-DE"/>
+        </w:rPr>
+      </w:pPr>
+      <w:r>
+        <w:rPr>
+          <w:rFonts w:ascii="Times New Roman" w:hAnsi="Times New Roman" w:cs="Times New Roman"/>
+          <w:i/>
+          <w:iCs/>
+          <w:lang w:val="de-DE"/>
+        </w:rPr>
         <w:t>gen x=rnormal()</w:t>
       </w:r>
     </w:p>
@@ -4992,7 +5395,6 @@
           <w:iCs/>
           <w:lang w:val="de-DE"/>
         </w:rPr>
-        <w:lastRenderedPageBreak/>
         <w:t>gen d1=2+z-x+3*u+rnormal()</w:t>
       </w:r>
     </w:p>
@@ -5153,6 +5555,155 @@
 <file path=word/numbering.xml><?xml version="1.0" encoding="utf-8"?>
 <w:numbering xmlns:wpc="http://schemas.microsoft.com/office/word/2010/wordprocessingCanvas" xmlns:cx="http://schemas.microsoft.com/office/drawing/2014/chartex" xmlns:cx1="http://schemas.microsoft.com/office/drawing/2015/9/8/chartex" xmlns:cx2="http://schemas.microsoft.com/office/drawing/2015/10/21/chartex" xmlns:cx3="http://schemas.microsoft.com/office/drawing/2016/5/9/chartex" xmlns:cx4="http://schemas.microsoft.com/office/drawing/2016/5/10/chartex" xmlns:cx5="http://schemas.microsoft.com/office/drawing/2016/5/11/chartex" xmlns:cx6="http://schemas.microsoft.com/office/drawing/2016/5/12/chartex" xmlns:cx7="http://schemas.microsoft.com/office/drawing/2016/5/13/chartex" xmlns:cx8="http://schemas.microsoft.com/office/drawing/2016/5/14/chartex" xmlns:mc="http://schemas.openxmlformats.org/markup-compatibility/2006" xmlns:aink="http://schemas.microsoft.com/office/drawing/2016/ink" xmlns:am3d="http://schemas.microsoft.com/office/drawing/2017/model3d" xmlns:o="urn:schemas-microsoft-com:office:office" xmlns:oel="http://schemas.microsoft.com/office/2019/extlst" xmlns:r="http://schemas.openxmlformats.org/officeDocument/2006/relationships" xmlns:m="http://schemas.openxmlformats.org/officeDocument/2006/math" xmlns:v="urn:schemas-microsoft-com:vml" xmlns:wp14="http://schemas.microsoft.com/office/word/2010/wordprocessingDrawing" xmlns:wp="http://schemas.openxmlformats.org/drawingml/2006/wordprocessingDrawing" xmlns:w10="urn:schemas-microsoft-com:office:word" xmlns:w="http://schemas.openxmlformats.org/wordprocessingml/2006/main" xmlns:w14="http://schemas.microsoft.com/office/word/2010/wordml" xmlns:w15="http://schemas.microsoft.com/office/word/2012/wordml" xmlns:w16cex="http://schemas.microsoft.com/office/word/2018/wordml/cex" xmlns:w16cid="http://schemas.microsoft.com/office/word/2016/wordml/cid" xmlns:w16="http://schemas.microsoft.com/office/word/2018/wordml" xmlns:w16du="http://schemas.microsoft.com/office/word/2023/wordml/word16du" xmlns:w16sdtdh="http://schemas.microsoft.com/office/word/2020/wordml/sdtdatahash" xmlns:w16sdtfl="http://schemas.microsoft.com/office/word/2024/wordml/sdtformatlock" xmlns:w16se="http://schemas.microsoft.com/office/word/2015/wordml/symex" xmlns:wpg="http://schemas.microsoft.com/office/word/2010/wordprocessingGroup" xmlns:wpi="http://schemas.microsoft.com/office/word/2010/wordprocessingInk" xmlns:wne="http://schemas.microsoft.com/office/word/2006/wordml" xmlns:wps="http://schemas.microsoft.com/office/word/2010/wordprocessingShape" mc:Ignorable="w14 w15 w16se w16cid w16 w16cex w16sdtdh w16sdtfl w16du wp14">
   <w:abstractNum w:abstractNumId="0" w15:restartNumberingAfterBreak="0">
+    <w:nsid w:val="7A1B3A26"/>
+    <w:multiLevelType w:val="multilevel"/>
+    <w:tmpl w:val="FD0A0A5A"/>
+    <w:lvl w:ilvl="0">
+      <w:start w:val="1"/>
+      <w:numFmt w:val="bullet"/>
+      <w:lvlText w:val=""/>
+      <w:lvlJc w:val="left"/>
+      <w:pPr>
+        <w:tabs>
+          <w:tab w:val="num" w:pos="720"/>
+        </w:tabs>
+        <w:ind w:left="720" w:hanging="360"/>
+      </w:pPr>
+      <w:rPr>
+        <w:rFonts w:ascii="Symbol" w:hAnsi="Symbol" w:hint="default"/>
+        <w:sz w:val="20"/>
+      </w:rPr>
+    </w:lvl>
+    <w:lvl w:ilvl="1" w:tentative="1">
+      <w:start w:val="1"/>
+      <w:numFmt w:val="bullet"/>
+      <w:lvlText w:val="o"/>
+      <w:lvlJc w:val="left"/>
+      <w:pPr>
+        <w:tabs>
+          <w:tab w:val="num" w:pos="1440"/>
+        </w:tabs>
+        <w:ind w:left="1440" w:hanging="360"/>
+      </w:pPr>
+      <w:rPr>
+        <w:rFonts w:ascii="Courier New" w:hAnsi="Courier New" w:hint="default"/>
+        <w:sz w:val="20"/>
+      </w:rPr>
+    </w:lvl>
+    <w:lvl w:ilvl="2" w:tentative="1">
+      <w:start w:val="1"/>
+      <w:numFmt w:val="bullet"/>
+      <w:lvlText w:val=""/>
+      <w:lvlJc w:val="left"/>
+      <w:pPr>
+        <w:tabs>
+          <w:tab w:val="num" w:pos="2160"/>
+        </w:tabs>
+        <w:ind w:left="2160" w:hanging="360"/>
+      </w:pPr>
+      <w:rPr>
+        <w:rFonts w:ascii="Wingdings" w:hAnsi="Wingdings" w:hint="default"/>
+        <w:sz w:val="20"/>
+      </w:rPr>
+    </w:lvl>
+    <w:lvl w:ilvl="3" w:tentative="1">
+      <w:start w:val="1"/>
+      <w:numFmt w:val="bullet"/>
+      <w:lvlText w:val=""/>
+      <w:lvlJc w:val="left"/>
+      <w:pPr>
+        <w:tabs>
+          <w:tab w:val="num" w:pos="2880"/>
+        </w:tabs>
+        <w:ind w:left="2880" w:hanging="360"/>
+      </w:pPr>
+      <w:rPr>
+        <w:rFonts w:ascii="Wingdings" w:hAnsi="Wingdings" w:hint="default"/>
+        <w:sz w:val="20"/>
+      </w:rPr>
+    </w:lvl>
+    <w:lvl w:ilvl="4" w:tentative="1">
+      <w:start w:val="1"/>
+      <w:numFmt w:val="bullet"/>
+      <w:lvlText w:val=""/>
+      <w:lvlJc w:val="left"/>
+      <w:pPr>
+        <w:tabs>
+          <w:tab w:val="num" w:pos="3600"/>
+        </w:tabs>
+        <w:ind w:left="3600" w:hanging="360"/>
+      </w:pPr>
+      <w:rPr>
+        <w:rFonts w:ascii="Wingdings" w:hAnsi="Wingdings" w:hint="default"/>
+        <w:sz w:val="20"/>
+      </w:rPr>
+    </w:lvl>
+    <w:lvl w:ilvl="5" w:tentative="1">
+      <w:start w:val="1"/>
+      <w:numFmt w:val="bullet"/>
+      <w:lvlText w:val=""/>
+      <w:lvlJc w:val="left"/>
+      <w:pPr>
+        <w:tabs>
+          <w:tab w:val="num" w:pos="4320"/>
+        </w:tabs>
+        <w:ind w:left="4320" w:hanging="360"/>
+      </w:pPr>
+      <w:rPr>
+        <w:rFonts w:ascii="Wingdings" w:hAnsi="Wingdings" w:hint="default"/>
+        <w:sz w:val="20"/>
+      </w:rPr>
+    </w:lvl>
+    <w:lvl w:ilvl="6" w:tentative="1">
+      <w:start w:val="1"/>
+      <w:numFmt w:val="bullet"/>
+      <w:lvlText w:val=""/>
+      <w:lvlJc w:val="left"/>
+      <w:pPr>
+        <w:tabs>
+          <w:tab w:val="num" w:pos="5040"/>
+        </w:tabs>
+        <w:ind w:left="5040" w:hanging="360"/>
+      </w:pPr>
+      <w:rPr>
+        <w:rFonts w:ascii="Wingdings" w:hAnsi="Wingdings" w:hint="default"/>
+        <w:sz w:val="20"/>
+      </w:rPr>
+    </w:lvl>
+    <w:lvl w:ilvl="7" w:tentative="1">
+      <w:start w:val="1"/>
+      <w:numFmt w:val="bullet"/>
+      <w:lvlText w:val=""/>
+      <w:lvlJc w:val="left"/>
+      <w:pPr>
+        <w:tabs>
+          <w:tab w:val="num" w:pos="5760"/>
+        </w:tabs>
+        <w:ind w:left="5760" w:hanging="360"/>
+      </w:pPr>
+      <w:rPr>
+        <w:rFonts w:ascii="Wingdings" w:hAnsi="Wingdings" w:hint="default"/>
+        <w:sz w:val="20"/>
+      </w:rPr>
+    </w:lvl>
+    <w:lvl w:ilvl="8" w:tentative="1">
+      <w:start w:val="1"/>
+      <w:numFmt w:val="bullet"/>
+      <w:lvlText w:val=""/>
+      <w:lvlJc w:val="left"/>
+      <w:pPr>
+        <w:tabs>
+          <w:tab w:val="num" w:pos="6480"/>
+        </w:tabs>
+        <w:ind w:left="6480" w:hanging="360"/>
+      </w:pPr>
+      <w:rPr>
+        <w:rFonts w:ascii="Wingdings" w:hAnsi="Wingdings" w:hint="default"/>
+        <w:sz w:val="20"/>
+      </w:rPr>
+    </w:lvl>
+  </w:abstractNum>
+  <w:abstractNum w:abstractNumId="1" w15:restartNumberingAfterBreak="0">
     <w:nsid w:val="7D13044F"/>
     <w:multiLevelType w:val="hybridMultilevel"/>
     <w:tmpl w:val="38CC3D68"/>
@@ -5242,6 +5793,9 @@
     </w:lvl>
   </w:abstractNum>
   <w:num w:numId="1" w16cid:durableId="494960295">
+    <w:abstractNumId w:val="1"/>
+  </w:num>
+  <w:num w:numId="2" w16cid:durableId="887573054">
     <w:abstractNumId w:val="0"/>
   </w:num>
 </w:numbering>
@@ -5697,7 +6251,6 @@
     <w:next w:val="Normal"/>
     <w:link w:val="Heading3Char"/>
     <w:uiPriority w:val="9"/>
-    <w:semiHidden/>
     <w:unhideWhenUsed/>
     <w:qFormat/>
     <w:rsid w:val="006C52E0"/>
@@ -5903,7 +6456,6 @@
     <w:basedOn w:val="DefaultParagraphFont"/>
     <w:link w:val="Heading3"/>
     <w:uiPriority w:val="9"/>
-    <w:semiHidden/>
     <w:rsid w:val="006C52E0"/>
     <w:rPr>
       <w:rFonts w:eastAsiaTheme="majorEastAsia" w:cstheme="majorBidi"/>

</xml_diff>